<commit_message>
Fix look-ahead in gasoline control: backward merge_asof; regenerate US sensitivity + manuscript
Co-Authored-By: Tatsuki Onishi <bougtoir@gmail.com>
</commit_message>
<xml_diff>
--- a/heat_accidents_mortality/output/manuscript/heat_crash_mortality.docx
+++ b/heat_accidents_mortality/output/manuscript/heat_crash_mortality.docx
@@ -27,7 +27,7 @@
         <w:spacing w:after="120" w:line="480" w:lineRule="auto"/>
       </w:pPr>
       <w:r>
-        <w:t>Objective: To test whether days that are hotter than the local seasonal norm are associated with higher daily traffic-crash mortality, a pathway through which heat-related impairment or undiagnosed heat illness could contribute to road deaths without being clinically recorded. Design: Time-series analysis of state-day (United States, US) and prefecture-day (Japan) panels using quasi-Poisson distributed-lag models of the local seasonal temperature anomaly, adjusting for spatial fixed effects, region-specific season, long-term trend and day of week. Setting and data: US Fatality Analysis Reporting System (FARS) [1] 2016-2022 and Japanese National Police Agency (NPA) accident open data [2] 2019-2024, each linked to Global Historical Climatology Network-Daily (GHCN-Daily) temperature [3]. Results: In the US (270,497 crash deaths), a +9 C anomaly raised same-day crash mortality (rate ratio, RR 1.165 (95% CI 1.134-1.196)), partly offset by a 1-3 day deficit; the effect was unchanged after adjustment for national vehicle-miles travelled and gasoline supplied (RR 1.164). Estimated net heat-attributable crash deaths were 513 per year (1.33%), comparable to the 527 officially recorded direct-heat deaths per year (ICD-10 X30, 2016-2020). In Japan (11,576 deaths) the estimate was in the same direction on some specifications but imprecise and not statistically significant. Conclusions: Unusually hot days are associated with an acute excess of US traffic-crash deaths of a magnitude similar to all officially recorded direct-heat mortality, consistent with an under-recognised heat contribution to road deaths. The aggregate association does not establish heat illness in any individual crash.</w:t>
+        <w:t>Objective: To test whether days that are hotter than the local seasonal norm are associated with higher daily traffic-crash mortality, a pathway through which heat-related impairment or undiagnosed heat illness could contribute to road deaths without being clinically recorded. Design: Time-series analysis of state-day (United States, US) and prefecture-day (Japan) panels using quasi-Poisson distributed-lag models of the local seasonal temperature anomaly, adjusting for spatial fixed effects, region-specific season, long-term trend and day of week. Setting and data: US Fatality Analysis Reporting System (FARS) [1] 2016-2022 and Japanese National Police Agency (NPA) accident open data [2] 2019-2024, each linked to Global Historical Climatology Network-Daily (GHCN-Daily) temperature [3]. Results: In the US (270,497 crash deaths), a +9 C anomaly raised same-day crash mortality (rate ratio, RR 1.165 (95% CI 1.134-1.196)), partly offset by a 1-3 day deficit; the effect was unchanged after adjustment for national vehicle-miles travelled and gasoline supplied (RR 1.162). Estimated net heat-attributable crash deaths were 513 per year (1.33%), comparable to the 527 officially recorded direct-heat deaths per year (ICD-10 X30, 2016-2020). In Japan (11,576 deaths) the estimate was in the same direction on some specifications but imprecise and not statistically significant. Conclusions: Unusually hot days are associated with an acute excess of US traffic-crash deaths of a magnitude similar to all officially recorded direct-heat mortality, consistent with an under-recognised heat contribution to road deaths. The aggregate association does not establish heat illness in any individual crash.</w:t>
       </w:r>
     </w:p>
     <w:p>
@@ -404,7 +404,7 @@
         <w:spacing w:after="120" w:line="480" w:lineRule="auto"/>
       </w:pPr>
       <w:r>
-        <w:t>The lag structure showed an acute same-day excess followed by a deficit at 1-3 days (RR 0.934 (0.902-0.967)), consistent with short-term mortality displacement (harvesting) rather than pure addition of deaths (Fig. 3; Table 2). The same-day association was essentially unchanged after adjusting for national vehicle-miles travelled and gasoline supplied (RR 1.164, 95% CI 1.134-1.195), indicating that day-to-day driving volume does not explain the effect.</w:t>
+        <w:t>The lag structure showed an acute same-day excess followed by a deficit at 1-3 days (RR 0.934 (0.902-0.967)), consistent with short-term mortality displacement (harvesting) rather than pure addition of deaths (Fig. 3; Table 2). The same-day association was essentially unchanged after adjusting for national vehicle-miles travelled and gasoline supplied (RR 1.162, 95% CI 1.132-1.193), indicating that day-to-day driving volume does not explain the effect.</w:t>
       </w:r>
     </w:p>
     <w:p/>

</xml_diff>

<commit_message>
Add Lancet-PH additional analyses: warming projection, time-of-day mechanism, road-user/age vulnerability
Co-Authored-By: Tatsuki Onishi <bougtoir@gmail.com>
</commit_message>
<xml_diff>
--- a/heat_accidents_mortality/output/manuscript/heat_crash_mortality.docx
+++ b/heat_accidents_mortality/output/manuscript/heat_crash_mortality.docx
@@ -27,7 +27,7 @@
         <w:spacing w:after="120" w:line="480" w:lineRule="auto"/>
       </w:pPr>
       <w:r>
-        <w:t>Objective: To test whether days that are hotter than the local seasonal norm are associated with higher daily traffic-crash mortality, a pathway through which heat-related impairment or undiagnosed heat illness could contribute to road deaths without being clinically recorded. Design: Time-series analysis of state-day (United States, US) and prefecture-day (Japan) panels using quasi-Poisson distributed-lag models of the local seasonal temperature anomaly, adjusting for spatial fixed effects, region-specific season, long-term trend and day of week. Setting and data: US Fatality Analysis Reporting System (FARS) [1] 2016-2022 and Japanese National Police Agency (NPA) accident open data [2] 2019-2024, each linked to Global Historical Climatology Network-Daily (GHCN-Daily) temperature [3]. Results: In the US (270,497 crash deaths), a +9 C anomaly raised same-day crash mortality (rate ratio, RR 1.165 (95% CI 1.134-1.196)), partly offset by a 1-3 day deficit; the effect was unchanged after adjustment for national vehicle-miles travelled and gasoline supplied (RR 1.162). Estimated net heat-attributable crash deaths were 513 per year (1.33%), comparable to the 527 officially recorded direct-heat deaths per year (ICD-10 X30, 2016-2020). In Japan (11,576 deaths) the estimate was in the same direction on some specifications but imprecise and not statistically significant. Conclusions: Unusually hot days are associated with an acute excess of US traffic-crash deaths of a magnitude similar to all officially recorded direct-heat mortality, consistent with an under-recognised heat contribution to road deaths. The aggregate association does not establish heat illness in any individual crash.</w:t>
+        <w:t>Objective: To test whether days that are hotter than the local seasonal norm are associated with higher daily traffic-crash mortality, a pathway through which heat-related impairment or undiagnosed heat illness could contribute to road deaths without being clinically recorded. Design: Time-series analysis of state-day (United States, US) and prefecture-day (Japan) panels using quasi-Poisson distributed-lag models of the local seasonal temperature anomaly, adjusting for spatial fixed effects, region-specific season, long-term trend and day of week. Setting and data: US Fatality Analysis Reporting System (FARS) [1] 2016-2022 and Japanese National Police Agency (NPA) accident open data [2] 2019-2024, each linked to Global Historical Climatology Network-Daily (GHCN-Daily) temperature [3]. Results: In the US (270,497 crash deaths), a +9 C anomaly raised same-day crash mortality (rate ratio, RR 1.165 (95% CI 1.134-1.196); CI, confidence interval), partly offset by a 1-3 day deficit; the effect was unchanged after adjustment for national vehicle-miles travelled and gasoline supplied (RR 1.162). The same-day excess was far larger for open-air road users (motorcyclists RR 2.141, pedestrians RR 1.213) than for enclosed vehicle occupants (RR 1.050) and peaked in the hottest hours of the day, consistent with a heat mechanism. Estimated net heat-attributable crash deaths were 513 per year (1.33%), comparable to the 527 officially recorded direct-heat deaths per year (ICD-10 X30, 2016-2020); uniform warming of +1 to +3 C projected 339-983 additional crash deaths per year. In Japan (11,576 deaths) the estimate was in the same direction on some specifications but imprecise and not statistically significant. Conclusions: Unusually hot days are associated with an acute excess of US traffic-crash deaths of a magnitude similar to all officially recorded direct-heat mortality, concentrated in heat-exposed road users, and projected to grow with warming, consistent with an under-recognised heat contribution to road deaths. The aggregate association does not establish heat illness in any individual crash.</w:t>
       </w:r>
     </w:p>
     <w:p>
@@ -67,7 +67,7 @@
         <w:spacing w:after="120" w:line="480" w:lineRule="auto"/>
       </w:pPr>
       <w:r>
-        <w:t>Because absolute temperature is strongly confounded by the seasonal cycle of driving exposure, our primary model used the anomaly. We fitted quasi-Poisson distributed-lag models [6] in which the exposure entered through a constant-free natural cubic spline within three lag windows (same-day, 1-3 days, 4-10 days), adjusting for spatial fixed effects, region-specific season (natural spline of day of year), a long-term time trend and day of week. Overdispersion was accommodated with a quasi-Poisson dispersion parameter. Net heat-attributable deaths were computed by the method of Gasparrini and Leone [7] with Monte Carlo confidence intervals. As a sensitivity analysis for the US we added national vehicle-miles travelled [8] and finished-motor-gasoline product supplied [9] as activity proxies. Officially recorded direct-heat deaths (ICD-10 X30) were obtained from CDC WONDER [10]. All data are public and the full pipeline is reproducible from source (see Data availability).</w:t>
+        <w:t>Because absolute temperature is strongly confounded by the seasonal cycle of driving exposure, our primary model used the anomaly. We fitted quasi-Poisson distributed-lag models [6] in which the exposure entered through a constant-free natural cubic spline within three lag windows (same-day, 1-3 days, 4-10 days), adjusting for spatial fixed effects, region-specific season (natural spline of day of year), a long-term time trend and day of week. Overdispersion was accommodated with a quasi-Poisson dispersion parameter. Net heat-attributable deaths were computed by the method of Gasparrini and Leone [7] with Monte Carlo (MC) confidence intervals (CIs). As a sensitivity analysis for the US we added national vehicle-miles travelled (VMT) [8] and finished-motor-gasoline product supplied [9] as activity proxies. Officially recorded direct-heat deaths (International Classification of Diseases, 10th revision [ICD-10] code X30) were obtained from CDC WONDER [10]. In three further US analyses we (i) refitted the same-day model within crash-hour bands to test whether the excess concentrates in the hottest hours; (ii) refitted it by road-user type (vehicle occupant, motorcyclist, pedestrian, cyclist) and age band from FARS person records, as a mechanistic and vulnerability analysis; and (iii) projected the additional crash deaths implied by uniform warming of the daily temperature distribution (+1, +2, +3 C), holding activity and baseline rates constant. All data are public and the full pipeline is reproducible from source (see Data availability).</w:t>
       </w:r>
     </w:p>
     <w:p>
@@ -663,7 +663,417 @@
         <w:spacing w:after="120" w:line="480" w:lineRule="auto"/>
       </w:pPr>
       <w:r>
-        <w:t>Net heat-attributable crash deaths were 513 per year (95% CI 410-615), an attributable fraction of 1.33% (Fig. 4; Table 3). This is of the same order as the 527 officially recorded direct-heat deaths per year (ICD-10 X30, 2016-2020; Fig. 5), so a heat contribution to crash deaths of a magnitude comparable to all recorded direct-heat mortality would be entirely absent from cause-of-death statistics.</w:t>
+        <w:t>Two features supported a heat mechanism rather than residual driving-activity confounding. First, the same-day excess differed sharply by road-user exposure (Fig. 4; Table 4): the effect was small for enclosed, often air-conditioned, vehicle occupants (RR 1.050 (1.016-1.085)) but far larger for open-air users -- motorcyclists (RR 2.141 (2.000-2.292)), pedestrians (RR 1.213 (1.145-1.286)) and cyclists (RR 1.237 (1.032-1.484)) -- a gradient that tracks direct bodily heat exposure and physical exertion rather than traffic volume [11]. Second, the excess was concentrated in the hottest part of the day: the same-day RR was largest for crashes at 12-17 h (RR 1.212 (1.155-1.272)) and weakest in the cool morning (06-11 h) (Fig. 5).</w:t>
+      </w:r>
+    </w:p>
+    <w:p/>
+    <w:p>
+      <w:pPr>
+        <w:jc w:val="center"/>
+      </w:pPr>
+      <w:r>
+        <w:drawing>
+          <wp:inline xmlns:a="http://schemas.openxmlformats.org/drawingml/2006/main" xmlns:pic="http://schemas.openxmlformats.org/drawingml/2006/picture">
+            <wp:extent cx="5120640" cy="3329646"/>
+            <wp:docPr id="4" name="Picture 4"/>
+            <wp:cNvGraphicFramePr>
+              <a:graphicFrameLocks noChangeAspect="1"/>
+            </wp:cNvGraphicFramePr>
+            <a:graphic>
+              <a:graphicData uri="http://schemas.openxmlformats.org/drawingml/2006/picture">
+                <pic:pic>
+                  <pic:nvPicPr>
+                    <pic:cNvPr id="0" name="fig_us_roaduser.png"/>
+                    <pic:cNvPicPr/>
+                  </pic:nvPicPr>
+                  <pic:blipFill>
+                    <a:blip r:embed="rId12"/>
+                    <a:stretch>
+                      <a:fillRect/>
+                    </a:stretch>
+                  </pic:blipFill>
+                  <pic:spPr>
+                    <a:xfrm>
+                      <a:off x="0" y="0"/>
+                      <a:ext cx="5120640" cy="3329646"/>
+                    </a:xfrm>
+                    <a:prstGeom prst="rect"/>
+                  </pic:spPr>
+                </pic:pic>
+              </a:graphicData>
+            </a:graphic>
+          </wp:inline>
+        </w:drawing>
+      </w:r>
+    </w:p>
+    <w:p>
+      <w:pPr>
+        <w:spacing w:before="280"/>
+      </w:pPr>
+      <w:r>
+        <w:rPr>
+          <w:b/>
+        </w:rPr>
+        <w:t xml:space="preserve">Figure 4. </w:t>
+      </w:r>
+      <w:r>
+        <w:t>United States same-day rate ratio of crash death for a +9 C anomaly by road-user type. Open-air users (motorcyclists, pedestrians, cyclists) show much larger heat effects than enclosed, often air-conditioned, vehicle occupants -- a gradient that tracks direct heat exposure rather than driving volume.</w:t>
+      </w:r>
+    </w:p>
+    <w:p/>
+    <w:p/>
+    <w:p>
+      <w:pPr>
+        <w:jc w:val="center"/>
+      </w:pPr>
+      <w:r>
+        <w:drawing>
+          <wp:inline xmlns:a="http://schemas.openxmlformats.org/drawingml/2006/main" xmlns:pic="http://schemas.openxmlformats.org/drawingml/2006/picture">
+            <wp:extent cx="5120640" cy="3874497"/>
+            <wp:docPr id="5" name="Picture 5"/>
+            <wp:cNvGraphicFramePr>
+              <a:graphicFrameLocks noChangeAspect="1"/>
+            </wp:cNvGraphicFramePr>
+            <a:graphic>
+              <a:graphicData uri="http://schemas.openxmlformats.org/drawingml/2006/picture">
+                <pic:pic>
+                  <pic:nvPicPr>
+                    <pic:cNvPr id="0" name="fig_us_timeofday.png"/>
+                    <pic:cNvPicPr/>
+                  </pic:nvPicPr>
+                  <pic:blipFill>
+                    <a:blip r:embed="rId13"/>
+                    <a:stretch>
+                      <a:fillRect/>
+                    </a:stretch>
+                  </pic:blipFill>
+                  <pic:spPr>
+                    <a:xfrm>
+                      <a:off x="0" y="0"/>
+                      <a:ext cx="5120640" cy="3874497"/>
+                    </a:xfrm>
+                    <a:prstGeom prst="rect"/>
+                  </pic:spPr>
+                </pic:pic>
+              </a:graphicData>
+            </a:graphic>
+          </wp:inline>
+        </w:drawing>
+      </w:r>
+    </w:p>
+    <w:p>
+      <w:pPr>
+        <w:spacing w:before="280"/>
+      </w:pPr>
+      <w:r>
+        <w:rPr>
+          <w:b/>
+        </w:rPr>
+        <w:t xml:space="preserve">Figure 5. </w:t>
+      </w:r>
+      <w:r>
+        <w:t>United States same-day rate ratio of crash death for a +9 C anomaly by crash hour of day. The excess is largest for crashes in the hottest part of the day (12-17 h) and weakest in the cool morning (06-11 h).</w:t>
+      </w:r>
+    </w:p>
+    <w:p/>
+    <w:p>
+      <w:pPr>
+        <w:spacing w:before="280"/>
+      </w:pPr>
+      <w:r>
+        <w:rPr>
+          <w:b/>
+        </w:rPr>
+        <w:t xml:space="preserve">Table 4. </w:t>
+      </w:r>
+      <w:r>
+        <w:t>United States same-day rate ratio of crash death for a +9 C anomaly, by road-user type and age band (vulnerability analysis).</w:t>
+      </w:r>
+    </w:p>
+    <w:tbl>
+      <w:tblPr>
+        <w:tblStyle w:val="TableGrid"/>
+        <w:tblW w:type="auto" w:w="0"/>
+        <w:tblLook w:firstColumn="1" w:firstRow="1" w:lastColumn="0" w:lastRow="0" w:noHBand="0" w:noVBand="1" w:val="04A0"/>
+      </w:tblPr>
+      <w:tblGrid>
+        <w:gridCol w:w="2880"/>
+        <w:gridCol w:w="2880"/>
+        <w:gridCol w:w="2880"/>
+      </w:tblGrid>
+      <w:tr>
+        <w:tc>
+          <w:tcPr>
+            <w:tcW w:type="dxa" w:w="2880"/>
+          </w:tcPr>
+          <w:p>
+            <w:r>
+              <w:rPr>
+                <w:b/>
+              </w:rPr>
+              <w:t>Subgroup</w:t>
+            </w:r>
+          </w:p>
+        </w:tc>
+        <w:tc>
+          <w:tcPr>
+            <w:tcW w:type="dxa" w:w="2880"/>
+          </w:tcPr>
+          <w:p>
+            <w:r>
+              <w:rPr>
+                <w:b/>
+              </w:rPr>
+              <w:t>Crash deaths</w:t>
+            </w:r>
+          </w:p>
+        </w:tc>
+        <w:tc>
+          <w:tcPr>
+            <w:tcW w:type="dxa" w:w="2880"/>
+          </w:tcPr>
+          <w:p>
+            <w:r>
+              <w:rPr>
+                <w:b/>
+              </w:rPr>
+              <w:t>Same-day RR (95% CI)</w:t>
+            </w:r>
+          </w:p>
+        </w:tc>
+      </w:tr>
+      <w:tr>
+        <w:tc>
+          <w:tcPr>
+            <w:tcW w:type="dxa" w:w="2880"/>
+          </w:tcPr>
+          <w:p>
+            <w:r>
+              <w:t>Vehicle occupant</w:t>
+            </w:r>
+          </w:p>
+        </w:tc>
+        <w:tc>
+          <w:tcPr>
+            <w:tcW w:type="dxa" w:w="2880"/>
+          </w:tcPr>
+          <w:p>
+            <w:r>
+              <w:t>178,365</w:t>
+            </w:r>
+          </w:p>
+        </w:tc>
+        <w:tc>
+          <w:tcPr>
+            <w:tcW w:type="dxa" w:w="2880"/>
+          </w:tcPr>
+          <w:p>
+            <w:r>
+              <w:t>1.050 (1.016-1.085)</w:t>
+            </w:r>
+          </w:p>
+        </w:tc>
+      </w:tr>
+      <w:tr>
+        <w:tc>
+          <w:tcPr>
+            <w:tcW w:type="dxa" w:w="2880"/>
+          </w:tcPr>
+          <w:p>
+            <w:r>
+              <w:t>Motorcyclist</w:t>
+            </w:r>
+          </w:p>
+        </w:tc>
+        <w:tc>
+          <w:tcPr>
+            <w:tcW w:type="dxa" w:w="2880"/>
+          </w:tcPr>
+          <w:p>
+            <w:r>
+              <w:t>38,248</w:t>
+            </w:r>
+          </w:p>
+        </w:tc>
+        <w:tc>
+          <w:tcPr>
+            <w:tcW w:type="dxa" w:w="2880"/>
+          </w:tcPr>
+          <w:p>
+            <w:r>
+              <w:t>2.141 (2.000-2.292)</w:t>
+            </w:r>
+          </w:p>
+        </w:tc>
+      </w:tr>
+      <w:tr>
+        <w:tc>
+          <w:tcPr>
+            <w:tcW w:type="dxa" w:w="2880"/>
+          </w:tcPr>
+          <w:p>
+            <w:r>
+              <w:t>Pedestrian</w:t>
+            </w:r>
+          </w:p>
+        </w:tc>
+        <w:tc>
+          <w:tcPr>
+            <w:tcW w:type="dxa" w:w="2880"/>
+          </w:tcPr>
+          <w:p>
+            <w:r>
+              <w:t>46,022</w:t>
+            </w:r>
+          </w:p>
+        </w:tc>
+        <w:tc>
+          <w:tcPr>
+            <w:tcW w:type="dxa" w:w="2880"/>
+          </w:tcPr>
+          <w:p>
+            <w:r>
+              <w:t>1.213 (1.145-1.286)</w:t>
+            </w:r>
+          </w:p>
+        </w:tc>
+      </w:tr>
+      <w:tr>
+        <w:tc>
+          <w:tcPr>
+            <w:tcW w:type="dxa" w:w="2880"/>
+          </w:tcPr>
+          <w:p>
+            <w:r>
+              <w:t>Cyclist</w:t>
+            </w:r>
+          </w:p>
+        </w:tc>
+        <w:tc>
+          <w:tcPr>
+            <w:tcW w:type="dxa" w:w="2880"/>
+          </w:tcPr>
+          <w:p>
+            <w:r>
+              <w:t>6,356</w:t>
+            </w:r>
+          </w:p>
+        </w:tc>
+        <w:tc>
+          <w:tcPr>
+            <w:tcW w:type="dxa" w:w="2880"/>
+          </w:tcPr>
+          <w:p>
+            <w:r>
+              <w:t>1.237 (1.032-1.484)</w:t>
+            </w:r>
+          </w:p>
+        </w:tc>
+      </w:tr>
+      <w:tr>
+        <w:tc>
+          <w:tcPr>
+            <w:tcW w:type="dxa" w:w="2880"/>
+          </w:tcPr>
+          <w:p>
+            <w:r>
+              <w:t>Age &lt;25 y</w:t>
+            </w:r>
+          </w:p>
+        </w:tc>
+        <w:tc>
+          <w:tcPr>
+            <w:tcW w:type="dxa" w:w="2880"/>
+          </w:tcPr>
+          <w:p>
+            <w:r>
+              <w:t>54,003</w:t>
+            </w:r>
+          </w:p>
+        </w:tc>
+        <w:tc>
+          <w:tcPr>
+            <w:tcW w:type="dxa" w:w="2880"/>
+          </w:tcPr>
+          <w:p>
+            <w:r>
+              <w:t>1.123 (1.059-1.191)</w:t>
+            </w:r>
+          </w:p>
+        </w:tc>
+      </w:tr>
+      <w:tr>
+        <w:tc>
+          <w:tcPr>
+            <w:tcW w:type="dxa" w:w="2880"/>
+          </w:tcPr>
+          <w:p>
+            <w:r>
+              <w:t>Age 25-64 y</w:t>
+            </w:r>
+          </w:p>
+        </w:tc>
+        <w:tc>
+          <w:tcPr>
+            <w:tcW w:type="dxa" w:w="2880"/>
+          </w:tcPr>
+          <w:p>
+            <w:r>
+              <w:t>166,699</w:t>
+            </w:r>
+          </w:p>
+        </w:tc>
+        <w:tc>
+          <w:tcPr>
+            <w:tcW w:type="dxa" w:w="2880"/>
+          </w:tcPr>
+          <w:p>
+            <w:r>
+              <w:t>1.177 (1.140-1.216)</w:t>
+            </w:r>
+          </w:p>
+        </w:tc>
+      </w:tr>
+      <w:tr>
+        <w:tc>
+          <w:tcPr>
+            <w:tcW w:type="dxa" w:w="2880"/>
+          </w:tcPr>
+          <w:p>
+            <w:r>
+              <w:t>Age 65+ y</w:t>
+            </w:r>
+          </w:p>
+        </w:tc>
+        <w:tc>
+          <w:tcPr>
+            <w:tcW w:type="dxa" w:w="2880"/>
+          </w:tcPr>
+          <w:p>
+            <w:r>
+              <w:t>49,680</w:t>
+            </w:r>
+          </w:p>
+        </w:tc>
+        <w:tc>
+          <w:tcPr>
+            <w:tcW w:type="dxa" w:w="2880"/>
+          </w:tcPr>
+          <w:p>
+            <w:r>
+              <w:t>1.167 (1.104-1.234)</w:t>
+            </w:r>
+          </w:p>
+        </w:tc>
+      </w:tr>
+    </w:tbl>
+    <w:p/>
+    <w:p>
+      <w:pPr>
+        <w:spacing w:after="120" w:line="480" w:lineRule="auto"/>
+      </w:pPr>
+      <w:r>
+        <w:t>Net heat-attributable crash deaths were 513 per year (95% CI 410-615), an attributable fraction of 1.33% (Fig. 6; Table 3). This is of the same order as the 527 officially recorded direct-heat deaths per year (ICD-10 X30, 2016-2020; Fig. 7), so a heat contribution to crash deaths of a magnitude comparable to all recorded direct-heat mortality would be entirely absent from cause-of-death statistics.</w:t>
       </w:r>
     </w:p>
     <w:p/>
@@ -675,7 +1085,7 @@
         <w:drawing>
           <wp:inline xmlns:a="http://schemas.openxmlformats.org/drawingml/2006/main" xmlns:pic="http://schemas.openxmlformats.org/drawingml/2006/picture">
             <wp:extent cx="5120640" cy="3918339"/>
-            <wp:docPr id="4" name="Picture 4"/>
+            <wp:docPr id="6" name="Picture 6"/>
             <wp:cNvGraphicFramePr>
               <a:graphicFrameLocks noChangeAspect="1"/>
             </wp:cNvGraphicFramePr>
@@ -687,7 +1097,7 @@
                     <pic:cNvPicPr/>
                   </pic:nvPicPr>
                   <pic:blipFill>
-                    <a:blip r:embed="rId12"/>
+                    <a:blip r:embed="rId14"/>
                     <a:stretch>
                       <a:fillRect/>
                     </a:stretch>
@@ -714,7 +1124,7 @@
         <w:rPr>
           <w:b/>
         </w:rPr>
-        <w:t xml:space="preserve">Figure 4. </w:t>
+        <w:t xml:space="preserve">Figure 6. </w:t>
       </w:r>
       <w:r>
         <w:t>United States estimated net heat-attributable crash deaths per year, 2016-2022.</w:t>
@@ -730,7 +1140,7 @@
         <w:drawing>
           <wp:inline xmlns:a="http://schemas.openxmlformats.org/drawingml/2006/main" xmlns:pic="http://schemas.openxmlformats.org/drawingml/2006/picture">
             <wp:extent cx="5120640" cy="3889368"/>
-            <wp:docPr id="5" name="Picture 5"/>
+            <wp:docPr id="7" name="Picture 7"/>
             <wp:cNvGraphicFramePr>
               <a:graphicFrameLocks noChangeAspect="1"/>
             </wp:cNvGraphicFramePr>
@@ -742,7 +1152,7 @@
                     <pic:cNvPicPr/>
                   </pic:nvPicPr>
                   <pic:blipFill>
-                    <a:blip r:embed="rId13"/>
+                    <a:blip r:embed="rId15"/>
                     <a:stretch>
                       <a:fillRect/>
                     </a:stretch>
@@ -769,7 +1179,7 @@
         <w:rPr>
           <w:b/>
         </w:rPr>
-        <w:t xml:space="preserve">Figure 5. </w:t>
+        <w:t xml:space="preserve">Figure 7. </w:t>
       </w:r>
       <w:r>
         <w:t>United States comparison of estimated net heat-attributable crash deaths per year with officially recorded direct-heat deaths (ICD-10 X30) from CDC WONDER.</w:t>
@@ -901,7 +1311,190 @@
         <w:spacing w:after="120" w:line="480" w:lineRule="auto"/>
       </w:pPr>
       <w:r>
-        <w:t>In Japan (11,576 crash deaths over 6 years) the anomaly exposure-response was imprecise, with a wide confidence band that included the null throughout (Fig. 6); the same-day point estimate for a +9 C anomaly was 0.940 (95% CI 0.743-1.190) and was not stable across specifications. Directly comparing the two countries (Fig. 7), the US shows a precise acute effect whereas the Japanese panel, with roughly fifteen times fewer annual crash deaths and sparser temperature coverage, is underpowered.</w:t>
+        <w:t>To gauge the trajectory under continued warming, we applied the estimated anomaly exposure-response to uniformly warmer daily temperatures, holding driving activity and baseline rates constant [12]. A uniform +1 C shift projected 339 additional US crash deaths per year (95% CI 250-428), rising to 983 (644-1356) at +3 C (Fig. 8; Table 5). These are scenario projections, not observed quantities, and assume the anomaly response is stable under a warmer mean climate.</w:t>
+      </w:r>
+    </w:p>
+    <w:p/>
+    <w:p>
+      <w:pPr>
+        <w:jc w:val="center"/>
+      </w:pPr>
+      <w:r>
+        <w:drawing>
+          <wp:inline xmlns:a="http://schemas.openxmlformats.org/drawingml/2006/main" xmlns:pic="http://schemas.openxmlformats.org/drawingml/2006/picture">
+            <wp:extent cx="5120640" cy="3852943"/>
+            <wp:docPr id="8" name="Picture 8"/>
+            <wp:cNvGraphicFramePr>
+              <a:graphicFrameLocks noChangeAspect="1"/>
+            </wp:cNvGraphicFramePr>
+            <a:graphic>
+              <a:graphicData uri="http://schemas.openxmlformats.org/drawingml/2006/picture">
+                <pic:pic>
+                  <pic:nvPicPr>
+                    <pic:cNvPr id="0" name="fig_us_projection.png"/>
+                    <pic:cNvPicPr/>
+                  </pic:nvPicPr>
+                  <pic:blipFill>
+                    <a:blip r:embed="rId16"/>
+                    <a:stretch>
+                      <a:fillRect/>
+                    </a:stretch>
+                  </pic:blipFill>
+                  <pic:spPr>
+                    <a:xfrm>
+                      <a:off x="0" y="0"/>
+                      <a:ext cx="5120640" cy="3852943"/>
+                    </a:xfrm>
+                    <a:prstGeom prst="rect"/>
+                  </pic:spPr>
+                </pic:pic>
+              </a:graphicData>
+            </a:graphic>
+          </wp:inline>
+        </w:drawing>
+      </w:r>
+    </w:p>
+    <w:p>
+      <w:pPr>
+        <w:spacing w:before="280"/>
+      </w:pPr>
+      <w:r>
+        <w:rPr>
+          <w:b/>
+        </w:rPr>
+        <w:t xml:space="preserve">Figure 8. </w:t>
+      </w:r>
+      <w:r>
+        <w:t>United States projected additional traffic-crash deaths per year under uniform warming of the daily temperature distribution by +1, +2 and +3 C, holding driving activity and baseline rates constant. Bars show the point estimate with 95% Monte Carlo confidence intervals; this is a scenario projection, not an observed quantity.</w:t>
+      </w:r>
+    </w:p>
+    <w:p/>
+    <w:p>
+      <w:pPr>
+        <w:spacing w:before="280"/>
+      </w:pPr>
+      <w:r>
+        <w:rPr>
+          <w:b/>
+        </w:rPr>
+        <w:t xml:space="preserve">Table 5. </w:t>
+      </w:r>
+      <w:r>
+        <w:t>United States projected additional traffic-crash deaths per year under uniform warming (activity held constant); scenario projection, not observed.</w:t>
+      </w:r>
+    </w:p>
+    <w:tbl>
+      <w:tblPr>
+        <w:tblStyle w:val="TableGrid"/>
+        <w:tblW w:type="auto" w:w="0"/>
+        <w:tblLook w:firstColumn="1" w:firstRow="1" w:lastColumn="0" w:lastRow="0" w:noHBand="0" w:noVBand="1" w:val="04A0"/>
+      </w:tblPr>
+      <w:tblGrid>
+        <w:gridCol w:w="4320"/>
+        <w:gridCol w:w="4320"/>
+      </w:tblGrid>
+      <w:tr>
+        <w:tc>
+          <w:tcPr>
+            <w:tcW w:type="dxa" w:w="4320"/>
+          </w:tcPr>
+          <w:p>
+            <w:r>
+              <w:rPr>
+                <w:b/>
+              </w:rPr>
+              <w:t>Warming</w:t>
+            </w:r>
+          </w:p>
+        </w:tc>
+        <w:tc>
+          <w:tcPr>
+            <w:tcW w:type="dxa" w:w="4320"/>
+          </w:tcPr>
+          <w:p>
+            <w:r>
+              <w:rPr>
+                <w:b/>
+              </w:rPr>
+              <w:t>Additional deaths/year (95% CI)</w:t>
+            </w:r>
+          </w:p>
+        </w:tc>
+      </w:tr>
+      <w:tr>
+        <w:tc>
+          <w:tcPr>
+            <w:tcW w:type="dxa" w:w="4320"/>
+          </w:tcPr>
+          <w:p>
+            <w:r>
+              <w:t>+1°C</w:t>
+            </w:r>
+          </w:p>
+        </w:tc>
+        <w:tc>
+          <w:tcPr>
+            <w:tcW w:type="dxa" w:w="4320"/>
+          </w:tcPr>
+          <w:p>
+            <w:r>
+              <w:t>339 (250-428)</w:t>
+            </w:r>
+          </w:p>
+        </w:tc>
+      </w:tr>
+      <w:tr>
+        <w:tc>
+          <w:tcPr>
+            <w:tcW w:type="dxa" w:w="4320"/>
+          </w:tcPr>
+          <w:p>
+            <w:r>
+              <w:t>+2°C</w:t>
+            </w:r>
+          </w:p>
+        </w:tc>
+        <w:tc>
+          <w:tcPr>
+            <w:tcW w:type="dxa" w:w="4320"/>
+          </w:tcPr>
+          <w:p>
+            <w:r>
+              <w:t>661 (459-864)</w:t>
+            </w:r>
+          </w:p>
+        </w:tc>
+      </w:tr>
+      <w:tr>
+        <w:tc>
+          <w:tcPr>
+            <w:tcW w:type="dxa" w:w="4320"/>
+          </w:tcPr>
+          <w:p>
+            <w:r>
+              <w:t>+3°C</w:t>
+            </w:r>
+          </w:p>
+        </w:tc>
+        <w:tc>
+          <w:tcPr>
+            <w:tcW w:type="dxa" w:w="4320"/>
+          </w:tcPr>
+          <w:p>
+            <w:r>
+              <w:t>983 (644-1356)</w:t>
+            </w:r>
+          </w:p>
+        </w:tc>
+      </w:tr>
+    </w:tbl>
+    <w:p/>
+    <w:p>
+      <w:pPr>
+        <w:spacing w:after="120" w:line="480" w:lineRule="auto"/>
+      </w:pPr>
+      <w:r>
+        <w:t>In Japan (11,576 crash deaths over 6 years) the anomaly exposure-response was imprecise, with a wide confidence band that included the null throughout (Fig. 9); the same-day point estimate for a +9 C anomaly was 0.940 (95% CI 0.743-1.190) and was not stable across specifications. Directly comparing the two countries (Fig. 10), the US shows a precise acute effect whereas the Japanese panel, with roughly fifteen times fewer annual crash deaths and sparser temperature coverage, is underpowered.</w:t>
       </w:r>
     </w:p>
     <w:p/>
@@ -913,7 +1506,7 @@
         <w:drawing>
           <wp:inline xmlns:a="http://schemas.openxmlformats.org/drawingml/2006/main" xmlns:pic="http://schemas.openxmlformats.org/drawingml/2006/picture">
             <wp:extent cx="5120640" cy="3660652"/>
-            <wp:docPr id="6" name="Picture 6"/>
+            <wp:docPr id="9" name="Picture 9"/>
             <wp:cNvGraphicFramePr>
               <a:graphicFrameLocks noChangeAspect="1"/>
             </wp:cNvGraphicFramePr>
@@ -925,7 +1518,7 @@
                     <pic:cNvPicPr/>
                   </pic:nvPicPr>
                   <pic:blipFill>
-                    <a:blip r:embed="rId14"/>
+                    <a:blip r:embed="rId17"/>
                     <a:stretch>
                       <a:fillRect/>
                     </a:stretch>
@@ -952,7 +1545,7 @@
         <w:rPr>
           <w:b/>
         </w:rPr>
-        <w:t xml:space="preserve">Figure 6. </w:t>
+        <w:t xml:space="preserve">Figure 9. </w:t>
       </w:r>
       <w:r>
         <w:t>Japan temperature-anomaly exposure-response (2019-2024). The estimate is imprecise: the confidence band is wide and includes the null throughout.</w:t>
@@ -968,7 +1561,7 @@
         <w:drawing>
           <wp:inline xmlns:a="http://schemas.openxmlformats.org/drawingml/2006/main" xmlns:pic="http://schemas.openxmlformats.org/drawingml/2006/picture">
             <wp:extent cx="5120640" cy="3761953"/>
-            <wp:docPr id="7" name="Picture 7"/>
+            <wp:docPr id="10" name="Picture 10"/>
             <wp:cNvGraphicFramePr>
               <a:graphicFrameLocks noChangeAspect="1"/>
             </wp:cNvGraphicFramePr>
@@ -980,7 +1573,7 @@
                     <pic:cNvPicPr/>
                   </pic:nvPicPr>
                   <pic:blipFill>
-                    <a:blip r:embed="rId15"/>
+                    <a:blip r:embed="rId18"/>
                     <a:stretch>
                       <a:fillRect/>
                     </a:stretch>
@@ -1007,7 +1600,7 @@
         <w:rPr>
           <w:b/>
         </w:rPr>
-        <w:t xml:space="preserve">Figure 7. </w:t>
+        <w:t xml:space="preserve">Figure 10. </w:t>
       </w:r>
       <w:r>
         <w:t>Same-day rate ratio of traffic-crash deaths for a +9 C anomaly, United States versus Japan. The US shows a precise acute effect; the Japanese estimate is underpowered.</w:t>
@@ -1035,7 +1628,15 @@
         <w:spacing w:after="120" w:line="480" w:lineRule="auto"/>
       </w:pPr>
       <w:r>
-        <w:t>Several limitations apply. First, this is an ecological, population-level association: it cannot establish that heat caused illness in any specific crash, and FARS and NPA carry no post-mortem heat diagnosis. Second, activity adjustment used national, not daily state-level, proxies. Third, exposure is measured at the spatial-unit level and misclassifies individual exposure. Fourth, the Japanese analysis is underpowered and inconclusive; its shorter series, far smaller death counts and sparser GHCN-Daily coverage preclude a firm estimate, and we therefore do not pool the two countries. These results motivate, but do not substitute for, individual-level studies linking crash decedents to ambient heat and, where available, post-mortem findings.</w:t>
+        <w:t>Two patterns argue against residual confounding by nice-weather driving and for a direct heat mechanism. The excess was strongly graded by bodily heat exposure -- minimal for enclosed, frequently air-conditioned vehicle occupants but several-fold larger for motorcyclists, pedestrians and cyclists, who are directly exposed and often physically exerting -- and it was concentrated in the hottest hours of the day. A driving-volume confounder would not produce either gradient, whereas both are expected if heat degrades psychomotor and cognitive performance. Applied to a warmer mean climate, the same exposure-response implies hundreds of additional US crash deaths per year per degree of warming; because these deaths would continue to be coded as ordinary crashes, the societal heat burden they represent would remain invisible to heat-mortality surveillance.</w:t>
+      </w:r>
+    </w:p>
+    <w:p>
+      <w:pPr>
+        <w:spacing w:after="120" w:line="480" w:lineRule="auto"/>
+      </w:pPr>
+      <w:r>
+        <w:t>Several limitations apply. First, this is an ecological, population-level association: it cannot establish that heat caused illness in any specific crash, and FARS and NPA carry no post-mortem heat diagnosis. Second, activity adjustment used national, not daily state-level, proxies. Third, exposure is measured at the spatial-unit level and misclassifies individual exposure. Fourth, the Japanese analysis is underpowered and inconclusive; its shorter series, far smaller death counts and sparser GHCN-Daily coverage preclude a firm estimate, and we therefore do not pool the two countries. Fifth, the warming projection is a scenario calculation that holds driving activity, the vehicle fleet and behaviour fixed and assumes the anomaly response is stable under a warmer mean climate; it should be read as illustrative of magnitude, not as a forecast. These results motivate, but do not substitute for, individual-level studies linking crash decedents to ambient heat and, where available, post-mortem findings.</w:t>
       </w:r>
     </w:p>
     <w:p>
@@ -1156,6 +1757,22 @@
       </w:pPr>
       <w:r>
         <w:t>10. Centers for Disease Control and Prevention. CDC WONDER Underlying Cause of Death database. https://wonder.cdc.gov/</w:t>
+      </w:r>
+    </w:p>
+    <w:p>
+      <w:pPr>
+        <w:spacing w:after="80"/>
+      </w:pPr>
+      <w:r>
+        <w:t>11. Daanen HAM, van de Vliert E, Huang X. Driving performance in cold, warm, and thermoneutral environments. Appl Ergon 2003;34:597-602.</w:t>
+      </w:r>
+    </w:p>
+    <w:p>
+      <w:pPr>
+        <w:spacing w:after="80"/>
+      </w:pPr>
+      <w:r>
+        <w:t>12. IPCC. Climate Change 2021: The Physical Science Basis. Contribution of Working Group I to the Sixth Assessment Report of the Intergovernmental Panel on Climate Change. Cambridge: Cambridge University Press; 2021.</w:t>
       </w:r>
     </w:p>
     <w:sectPr>

</xml_diff>

<commit_message>
Lancet PH submission prep: 5-para summary, research-in-context, superscript refs, STROBE/cover letter, separate figures; soften mechanism claims
- Restructure abstract to Lancet semi-structured Summary (Background/Methods/Findings/Interpretation/Funding), 250 words
- Add Research in context panel; superscript Vancouver citations (Word font superscript)
- Add title-page author block and end declarations (Contributors, DoI, Role of funding, AI use, Data sharing) as placeholders
- Soften road-user/time-of-day mechanism claims; add per-mode activity confounding, multiplicity and serial-correlation limitations; note overnight (00-05h) band also elevated
- New outputs: legends-only submission docx, submission_figures/, strobe_checklist.docx, cover_letter.docx
- Point public sync at the merged mainline branch so the mirror reproduces the manuscript

Co-Authored-By: Tatsuki Onishi <bougtoir@gmail.com>
</commit_message>
<xml_diff>
--- a/heat_accidents_mortality/output/manuscript/heat_crash_mortality.docx
+++ b/heat_accidents_mortality/output/manuscript/heat_crash_mortality.docx
@@ -16,10 +16,34 @@
     </w:p>
     <w:p>
       <w:pPr>
+        <w:jc w:val="center"/>
+      </w:pPr>
+      <w:r>
+        <w:t>[PLACEHOLDER author list — Given-name Family-name, degrees; ... — replace before submission]</w:t>
+      </w:r>
+    </w:p>
+    <w:p>
+      <w:pPr>
+        <w:jc w:val="center"/>
+      </w:pPr>
+      <w:r>
+        <w:t>[PLACEHOLDER affiliations, numbered to authors]</w:t>
+      </w:r>
+    </w:p>
+    <w:p>
+      <w:pPr>
+        <w:jc w:val="center"/>
+      </w:pPr>
+      <w:r>
+        <w:t>Correspondence to: [PLACEHOLDER corresponding author, address, email, ORCID]</w:t>
+      </w:r>
+    </w:p>
+    <w:p>
+      <w:pPr>
         <w:pStyle w:val="Heading1"/>
       </w:pPr>
       <w:r>
-        <w:t>Abstract</w:t>
+        <w:t>Summary</w:t>
       </w:r>
     </w:p>
     <w:p>
@@ -27,7 +51,119 @@
         <w:spacing w:after="120" w:line="480" w:lineRule="auto"/>
       </w:pPr>
       <w:r>
-        <w:t>Objective: To test whether days that are hotter than the local seasonal norm are associated with higher daily traffic-crash mortality, a pathway through which heat-related impairment or undiagnosed heat illness could contribute to road deaths without being clinically recorded. Design: Time-series analysis of state-day (United States, US) and prefecture-day (Japan) panels using quasi-Poisson distributed-lag models of the local seasonal temperature anomaly, adjusting for spatial fixed effects, region-specific season, long-term trend and day of week. Setting and data: US Fatality Analysis Reporting System (FARS) [1] 2016-2022 and Japanese National Police Agency (NPA) accident open data [2] 2019-2024, each linked to Global Historical Climatology Network-Daily (GHCN-Daily) temperature [3]. Results: In the US (270,497 crash deaths), a +9 C anomaly raised same-day crash mortality (rate ratio, RR 1.165 (95% CI 1.134-1.196); CI, confidence interval), partly offset by a 1-3 day deficit; the effect was unchanged after adjustment for national vehicle-miles travelled and gasoline supplied (RR 1.162). The same-day excess was far larger for open-air road users (motorcyclists RR 2.141, pedestrians RR 1.213) than for enclosed vehicle occupants (RR 1.050) and peaked in the hottest hours of the day, consistent with a heat mechanism. Estimated net heat-attributable crash deaths were 513 per year (1.33%), comparable to the 527 officially recorded direct-heat deaths per year (ICD-10 X30, 2016-2020); uniform warming of +1 to +3 C projected 339-983 additional crash deaths per year. In Japan (11,576 deaths) the estimate was in the same direction on some specifications but imprecise and not statistically significant. Conclusions: Unusually hot days are associated with an acute excess of US traffic-crash deaths of a magnitude similar to all officially recorded direct-heat mortality, concentrated in heat-exposed road users, and projected to grow with warming, consistent with an under-recognised heat contribution to road deaths. The aggregate association does not establish heat illness in any individual crash.</w:t>
+        <w:rPr>
+          <w:b/>
+        </w:rPr>
+        <w:t xml:space="preserve">Background </w:t>
+      </w:r>
+      <w:r>
+        <w:t>Heat waves are increasing under climate change and ambient heat drives mortality. Because driving continues in the heat, some fatal crashes may involve heat-related impairment or undiagnosed heat illness that is never recorded. We estimated the potential population-level traffic-crash mortality burden of such under-recognised heat effects in the USA and Japan.</w:t>
+      </w:r>
+    </w:p>
+    <w:p>
+      <w:pPr>
+        <w:spacing w:after="120" w:line="480" w:lineRule="auto"/>
+      </w:pPr>
+      <w:r>
+        <w:rPr>
+          <w:b/>
+        </w:rPr>
+        <w:t xml:space="preserve">Methods </w:t>
+      </w:r>
+      <w:r>
+        <w:t>In this ecological time-series study we fitted quasi-Poisson distributed-lag models of the local seasonal temperature anomaly to state-day (USA) and prefecture-day (Japan) panels, adjusting for spatial, seasonal, long-term-trend and day-of-week terms. Data were the US Fatality Analysis Reporting System (2016-2022) and Japanese National Police Agency accident open data (2019-2024), linked to Global Historical Climatology Network-Daily (GHCN-Daily) temperature.</w:t>
+      </w:r>
+    </w:p>
+    <w:p>
+      <w:pPr>
+        <w:spacing w:after="120" w:line="480" w:lineRule="auto"/>
+      </w:pPr>
+      <w:r>
+        <w:rPr>
+          <w:b/>
+        </w:rPr>
+        <w:t xml:space="preserve">Findings </w:t>
+      </w:r>
+      <w:r>
+        <w:t>In the USA (270,497 crash deaths) a +9°C anomaly raised same-day crash mortality (rate ratio [RR] 1.165 (95% CI 1.134-1.196)), unchanged after adjusting for national driving activity (RR 1.162). The excess was larger for open-air road users (motorcyclists 2.141, pedestrians 1.213) than vehicle occupants (1.050). Net heat-attributable deaths were 513 per year (1.33%), similar to the 527 officially recorded direct-heat deaths per year (ICD-10 X30); +1 to +3°C warming projected 339-983 additional deaths per year. In Japan (11,576 deaths) the estimate was directionally similar but imprecise.</w:t>
+      </w:r>
+    </w:p>
+    <w:p>
+      <w:pPr>
+        <w:spacing w:after="120" w:line="480" w:lineRule="auto"/>
+      </w:pPr>
+      <w:r>
+        <w:rPr>
+          <w:b/>
+        </w:rPr>
+        <w:t xml:space="preserve">Interpretation </w:t>
+      </w:r>
+      <w:r>
+        <w:t>Unusually hot days are associated with an acute excess of US traffic-crash deaths comparable to all recorded direct-heat mortality, concentrated in heat-exposed road users and projected to grow with warming. They are consistent with an under-recognised heat contribution but cannot establish heat illness in any individual crash, and open-air gradients may partly reflect weather-related activity.</w:t>
+      </w:r>
+    </w:p>
+    <w:p>
+      <w:pPr>
+        <w:spacing w:after="120" w:line="480" w:lineRule="auto"/>
+      </w:pPr>
+      <w:r>
+        <w:rPr>
+          <w:b/>
+        </w:rPr>
+        <w:t xml:space="preserve">Funding </w:t>
+      </w:r>
+      <w:r>
+        <w:t>None.</w:t>
+      </w:r>
+    </w:p>
+    <w:p>
+      <w:pPr>
+        <w:pStyle w:val="Heading1"/>
+      </w:pPr>
+      <w:r>
+        <w:t>Research in context</w:t>
+      </w:r>
+    </w:p>
+    <w:p>
+      <w:pPr>
+        <w:spacing w:after="120" w:line="480" w:lineRule="auto"/>
+      </w:pPr>
+      <w:r>
+        <w:rPr>
+          <w:b/>
+        </w:rPr>
+        <w:t xml:space="preserve">Evidence before this study </w:t>
+      </w:r>
+      <w:r>
+        <w:t>Ambient heat is a well-established driver of daily mortality, and distributed-lag and distributed-lag non-linear models linking temperature to death are a mature methodology. Prior work has largely focused on cardiovascular, respiratory, and all-cause mortality; heat illness is thought to be substantially under-recorded because it is rarely investigated after death. Traffic-crash deaths, which seldom undergo a heat-oriented post-mortem examination, have received little attention as a possible reservoir of unrecognised heat mortality. We are not aware of national population-level studies quantifying the acute crash-mortality burden of hotter-than-normal days alongside officially recorded direct-heat deaths.</w:t>
+      </w:r>
+    </w:p>
+    <w:p>
+      <w:pPr>
+        <w:spacing w:after="120" w:line="480" w:lineRule="auto"/>
+      </w:pPr>
+      <w:r>
+        <w:rPr>
+          <w:b/>
+        </w:rPr>
+        <w:t xml:space="preserve">Added value of this study </w:t>
+      </w:r>
+      <w:r>
+        <w:t>Using only public data, we show at the population level that days hotter than the local seasonal norm carry an acute excess of US traffic-crash deaths that persists after adjustment for national driving activity, is concentrated in heat-exposed open-air road users, and is comparable in magnitude to all officially recorded direct-heat mortality. We provide scenario projections showing this hidden burden would grow under uniform warming, and we report a much weaker, imprecise signal in Japan.</w:t>
+      </w:r>
+    </w:p>
+    <w:p>
+      <w:pPr>
+        <w:spacing w:after="120" w:line="480" w:lineRule="auto"/>
+      </w:pPr>
+      <w:r>
+        <w:rPr>
+          <w:b/>
+        </w:rPr>
+        <w:t xml:space="preserve">Implications of all the available evidence </w:t>
+      </w:r>
+      <w:r>
+        <w:t>The results suggest that routine cause-of-death coding may miss a heat contribution to road deaths of societal importance, and that this burden is sensitive to future warming. Because the analysis is ecological, it cannot attribute any individual crash to heat illness and cannot exclude weather-related changes in activity; it motivates individual-level investigation, such as heat-aware forensic assessment of crash fatalities.</w:t>
       </w:r>
     </w:p>
     <w:p>
@@ -43,7 +179,16 @@
         <w:spacing w:after="120" w:line="480" w:lineRule="auto"/>
       </w:pPr>
       <w:r>
-        <w:t>Heat waves are becoming more frequent under climate change, and ambient heat is an established driver of mortality [4,5]. Occupational and driving activity do not stop during heat, so some fatal accidents plausibly involve heat-related impairment or frank heat illness. Traffic-crash deaths are of particular interest because decedents rarely undergo the post-mortem assessment that would identify a heat contribution, so any such contribution would be largely invisible in routine cause-of-death coding. We therefore ask whether days that are hotter than the local seasonal norm carry excess traffic-crash mortality, and how the magnitude compares with officially recorded direct-heat deaths. This is an ecological, population-level study whose aim is to gauge the potential societal burden of under-recognised heat illness -- the deaths that would be missing from official heat statistics -- rather than to diagnose heat illness in any individual crash.</w:t>
+        <w:t xml:space="preserve">Heat waves are becoming more frequent under climate change, and ambient heat is an established driver of mortality </w:t>
+      </w:r>
+      <w:r>
+        <w:rPr>
+          <w:vertAlign w:val="superscript"/>
+        </w:rPr>
+        <w:t>1,2</w:t>
+      </w:r>
+      <w:r>
+        <w:t>. Occupational and driving activity do not stop during heat, so some fatal accidents plausibly involve heat-related impairment or frank heat illness. Traffic-crash deaths are of particular interest because decedents rarely undergo the post-mortem assessment that would identify a heat contribution, so any such contribution would be largely invisible in routine cause-of-death coding. We therefore ask whether days that are hotter than the local seasonal norm carry excess traffic-crash mortality, and how the magnitude compares with officially recorded direct-heat deaths. This is an ecological, population-level study whose aim is to gauge the potential societal burden of under-recognised heat illness -- the deaths that would be missing from official heat statistics -- rather than to diagnose heat illness in any individual crash.</w:t>
       </w:r>
     </w:p>
     <w:p>
@@ -59,7 +204,34 @@
         <w:spacing w:after="120" w:line="480" w:lineRule="auto"/>
       </w:pPr>
       <w:r>
-        <w:t>We built daily panels of traffic-crash deaths by US state (FARS, 2016-2022) [1] and by Japanese prefecture (NPA accident open data, 2019-2024) [2]. Daily mean temperature was derived from GHCN-Daily stations [3] as the mean of TMAX and TMIN, aggregated to each spatial unit from the nearest reporting stations. For each unit we estimated a cyclic day-of-year climatology and defined the temperature anomaly as the observed minus the climatological temperature.</w:t>
+        <w:t xml:space="preserve">We built daily panels of traffic-crash deaths by US state (FARS, 2016-2022) </w:t>
+      </w:r>
+      <w:r>
+        <w:rPr>
+          <w:vertAlign w:val="superscript"/>
+        </w:rPr>
+        <w:t>3</w:t>
+      </w:r>
+      <w:r>
+        <w:t xml:space="preserve"> and by Japanese prefecture (NPA accident open data, 2019-2024) </w:t>
+      </w:r>
+      <w:r>
+        <w:rPr>
+          <w:vertAlign w:val="superscript"/>
+        </w:rPr>
+        <w:t>4</w:t>
+      </w:r>
+      <w:r>
+        <w:t xml:space="preserve">. Daily mean temperature was derived from GHCN-Daily stations </w:t>
+      </w:r>
+      <w:r>
+        <w:rPr>
+          <w:vertAlign w:val="superscript"/>
+        </w:rPr>
+        <w:t>5</w:t>
+      </w:r>
+      <w:r>
+        <w:t xml:space="preserve"> as the mean of TMAX and TMIN, aggregated to each spatial unit from the nearest reporting stations. For each unit we estimated a cyclic day-of-year climatology and defined the temperature anomaly as the observed minus the climatological temperature.</w:t>
       </w:r>
     </w:p>
     <w:p>
@@ -67,7 +239,52 @@
         <w:spacing w:after="120" w:line="480" w:lineRule="auto"/>
       </w:pPr>
       <w:r>
-        <w:t>Because absolute temperature is strongly confounded by the seasonal cycle of driving exposure, our primary model used the anomaly. We fitted quasi-Poisson distributed-lag models [6] in which the exposure entered through a constant-free natural cubic spline within three lag windows (same-day, 1-3 days, 4-10 days), adjusting for spatial fixed effects, region-specific season (natural spline of day of year), a long-term time trend and day of week. Overdispersion was accommodated with a quasi-Poisson dispersion parameter. Net heat-attributable deaths were computed by the method of Gasparrini and Leone [7] with Monte Carlo (MC) confidence intervals (CIs). As a sensitivity analysis for the US we added national vehicle-miles travelled (VMT) [8] and finished-motor-gasoline product supplied [9] as activity proxies. Officially recorded direct-heat deaths (International Classification of Diseases, 10th revision [ICD-10] code X30) were obtained from CDC WONDER [10]. In three further US analyses we (i) refitted the same-day model within crash-hour bands to test whether the excess concentrates in the hottest hours; (ii) refitted it by road-user type (vehicle occupant, motorcyclist, pedestrian, cyclist) and age band from FARS person records, as a mechanistic and vulnerability analysis; and (iii) projected the additional crash deaths implied by uniform warming of the daily temperature distribution (+1, +2, +3 C), holding activity and baseline rates constant. All data are public and the full pipeline is reproducible from source (see Data availability).</w:t>
+        <w:t xml:space="preserve">Because absolute temperature is strongly confounded by the seasonal cycle of driving exposure, our primary model used the anomaly. We fitted quasi-Poisson distributed-lag models </w:t>
+      </w:r>
+      <w:r>
+        <w:rPr>
+          <w:vertAlign w:val="superscript"/>
+        </w:rPr>
+        <w:t>6</w:t>
+      </w:r>
+      <w:r>
+        <w:t xml:space="preserve"> in which the exposure entered through a constant-free natural cubic spline within three lag windows (same-day, 1-3 days, 4-10 days), adjusting for spatial fixed effects, region-specific season (natural spline of day of year), a long-term time trend and day of week. Overdispersion was accommodated with a quasi-Poisson dispersion parameter. Net heat-attributable deaths were computed by the method of Gasparrini and Leone </w:t>
+      </w:r>
+      <w:r>
+        <w:rPr>
+          <w:vertAlign w:val="superscript"/>
+        </w:rPr>
+        <w:t>7</w:t>
+      </w:r>
+      <w:r>
+        <w:t xml:space="preserve"> with Monte Carlo (MC) confidence intervals (CIs). As a sensitivity analysis for the US we added national vehicle-miles travelled (VMT) </w:t>
+      </w:r>
+      <w:r>
+        <w:rPr>
+          <w:vertAlign w:val="superscript"/>
+        </w:rPr>
+        <w:t>8</w:t>
+      </w:r>
+      <w:r>
+        <w:t xml:space="preserve"> and finished-motor-gasoline product supplied </w:t>
+      </w:r>
+      <w:r>
+        <w:rPr>
+          <w:vertAlign w:val="superscript"/>
+        </w:rPr>
+        <w:t>9</w:t>
+      </w:r>
+      <w:r>
+        <w:t xml:space="preserve"> as activity proxies. Officially recorded direct-heat deaths (International Classification of Diseases, 10th revision [ICD-10] code X30) were obtained from CDC WONDER </w:t>
+      </w:r>
+      <w:r>
+        <w:rPr>
+          <w:vertAlign w:val="superscript"/>
+        </w:rPr>
+        <w:t>10</w:t>
+      </w:r>
+      <w:r>
+        <w:t>. In three further US analyses we (i) refitted the same-day model within crash-hour bands to test whether the excess concentrates in the hottest hours; (ii) refitted it by road-user type (vehicle occupant, motorcyclist, pedestrian, cyclist) and age band from FARS person records, as a mechanistic and vulnerability analysis; and (iii) projected the additional crash deaths implied by uniform warming of the daily temperature distribution (+1, +2, +3 C), holding activity and baseline rates constant. All data are public and the full pipeline is reproducible from source (see Data sharing). Reporting follows the Strengthening the Reporting of Observational Studies in Epidemiology (STROBE) guideline (checklist provided).</w:t>
       </w:r>
     </w:p>
     <w:p>
@@ -663,7 +880,16 @@
         <w:spacing w:after="120" w:line="480" w:lineRule="auto"/>
       </w:pPr>
       <w:r>
-        <w:t>Two features supported a heat mechanism rather than residual driving-activity confounding. First, the same-day excess differed sharply by road-user exposure (Fig. 4; Table 4): the effect was small for enclosed, often air-conditioned, vehicle occupants (RR 1.050 (1.016-1.085)) but far larger for open-air users -- motorcyclists (RR 2.141 (2.000-2.292)), pedestrians (RR 1.213 (1.145-1.286)) and cyclists (RR 1.237 (1.032-1.484)) -- a gradient that tracks direct bodily heat exposure and physical exertion rather than traffic volume [11]. Second, the excess was concentrated in the hottest part of the day: the same-day RR was largest for crashes at 12-17 h (RR 1.212 (1.155-1.272)) and weakest in the cool morning (06-11 h) (Fig. 5).</w:t>
+        <w:t xml:space="preserve">Two exploratory analyses were consistent with a heat mechanism, although neither can exclude residual confounding. First, the same-day excess differed by road-user exposure (Fig. 4; Table 4): the effect was small for enclosed, often air-conditioned, vehicle occupants (RR 1.050 (1.016-1.085)) but larger for open-air users -- motorcyclists (RR 2.141 (2.000-2.292)), pedestrians (RR 1.213 (1.145-1.286)) and cyclists (RR 1.237 (1.032-1.484)) -- a gradient consistent with direct bodily heat exposure and physical exertion </w:t>
+      </w:r>
+      <w:r>
+        <w:rPr>
+          <w:vertAlign w:val="superscript"/>
+        </w:rPr>
+        <w:t>11</w:t>
+      </w:r>
+      <w:r>
+        <w:t>, though it could also partly reflect greater discretionary open-air travel (motorcycling, cycling, walking) on hotter-than-normal days, which our aggregate activity proxies do not capture by mode. Second, the excess was largest for crashes in the hottest part of the day (12-17 h; RR 1.212 (1.155-1.272)) and weakest in the cool morning (06-11 h; RR 1.062 (1.000-1.127)); the overnight band was also elevated (00-05 h; RR 1.179 (1.110-1.253)), so the diurnal pattern is not a clean daytime-only gradient (Fig. 5). These road-user, age and time-of-day analyses are hypothesis-generating: they involve multiple unadjusted comparisons and are not individual-level tests of susceptibility or mechanism.</w:t>
       </w:r>
     </w:p>
     <w:p/>
@@ -1311,7 +1537,16 @@
         <w:spacing w:after="120" w:line="480" w:lineRule="auto"/>
       </w:pPr>
       <w:r>
-        <w:t>To gauge the trajectory under continued warming, we applied the estimated anomaly exposure-response to uniformly warmer daily temperatures, holding driving activity and baseline rates constant [12]. A uniform +1 C shift projected 339 additional US crash deaths per year (95% CI 250-428), rising to 983 (644-1356) at +3 C (Fig. 8; Table 5). These are scenario projections, not observed quantities, and assume the anomaly response is stable under a warmer mean climate.</w:t>
+        <w:t xml:space="preserve">To gauge the trajectory under continued warming, we applied the estimated anomaly exposure-response to uniformly warmer daily temperatures, holding driving activity and baseline rates constant </w:t>
+      </w:r>
+      <w:r>
+        <w:rPr>
+          <w:vertAlign w:val="superscript"/>
+        </w:rPr>
+        <w:t>12</w:t>
+      </w:r>
+      <w:r>
+        <w:t>. A uniform +1 C shift projected 339 additional US crash deaths per year (95% CI 250-428), rising to 983 (644-1356) at +3 C (Fig. 8; Table 5). These are scenario projections, not observed quantities, and assume the anomaly response is stable under a warmer mean climate.</w:t>
       </w:r>
     </w:p>
     <w:p/>
@@ -1628,7 +1863,7 @@
         <w:spacing w:after="120" w:line="480" w:lineRule="auto"/>
       </w:pPr>
       <w:r>
-        <w:t>Two patterns argue against residual confounding by nice-weather driving and for a direct heat mechanism. The excess was strongly graded by bodily heat exposure -- minimal for enclosed, frequently air-conditioned vehicle occupants but several-fold larger for motorcyclists, pedestrians and cyclists, who are directly exposed and often physically exerting -- and it was concentrated in the hottest hours of the day. A driving-volume confounder would not produce either gradient, whereas both are expected if heat degrades psychomotor and cognitive performance. Applied to a warmer mean climate, the same exposure-response implies hundreds of additional US crash deaths per year per degree of warming; because these deaths would continue to be coded as ordinary crashes, the societal heat burden they represent would remain invisible to heat-mortality surveillance.</w:t>
+        <w:t>Two patterns are consistent with a direct heat mechanism rather than with confounding by aggregate driving volume. The excess was graded by bodily heat exposure -- minimal for enclosed, frequently air-conditioned vehicle occupants but several-fold larger for motorcyclists, pedestrians and cyclists, who are directly exposed and often physically exerting -- and it was largest in the hottest hours of the day. Both are expected if heat degrades psychomotor and cognitive performance. We caution, however, that these gradients are not proof of mechanism: open-air travel is itself weather-elastic, so more motorcycling, cycling and walking on hotter-than-normal days could inflate the open-air estimates through greater exposure rather than physiology, and our activity proxies are national and not mode-specific. Applied to a warmer mean climate, the same exposure-response implies hundreds of additional US crash deaths per year per degree of warming; because these deaths would continue to be coded as ordinary crashes, the societal heat burden they represent would remain invisible to heat-mortality surveillance.</w:t>
       </w:r>
     </w:p>
     <w:p>
@@ -1636,7 +1871,7 @@
         <w:spacing w:after="120" w:line="480" w:lineRule="auto"/>
       </w:pPr>
       <w:r>
-        <w:t>Several limitations apply. First, this is an ecological, population-level association: it cannot establish that heat caused illness in any specific crash, and FARS and NPA carry no post-mortem heat diagnosis. Second, activity adjustment used national, not daily state-level, proxies. Third, exposure is measured at the spatial-unit level and misclassifies individual exposure. Fourth, the Japanese analysis is underpowered and inconclusive; its shorter series, far smaller death counts and sparser GHCN-Daily coverage preclude a firm estimate, and we therefore do not pool the two countries. Fifth, the warming projection is a scenario calculation that holds driving activity, the vehicle fleet and behaviour fixed and assumes the anomaly response is stable under a warmer mean climate; it should be read as illustrative of magnitude, not as a forecast. These results motivate, but do not substitute for, individual-level studies linking crash decedents to ambient heat and, where available, post-mortem findings.</w:t>
+        <w:t>Several limitations apply. First, this is an ecological, population-level association: it cannot establish that heat caused illness in any specific crash, and FARS and NPA carry no post-mortem heat diagnosis. Second, activity adjustment used national, not daily state-level, proxies. Third, exposure is measured at the spatial-unit level and misclassifies individual exposure. Fourth, the Japanese analysis is underpowered and inconclusive; its shorter series, far smaller death counts and sparser GHCN-Daily coverage preclude a firm estimate, and we therefore do not pool the two countries. Fifth, the warming projection is a scenario calculation that holds driving activity, the vehicle fleet and behaviour fixed and assumes the anomaly response is stable under a warmer mean climate; it should be read as illustrative of magnitude, not as a forecast. Sixth, the road-user, age and time-of-day subgroup analyses are exploratory: they entail multiple comparisons without formal adjustment, and the open-air road-user gradient may in part reflect weather-related differences in activity rather than physiology. Finally, inference rests on a quasi-Poisson dispersion adjustment; residual serial correlation could still understate uncertainty. These results motivate, but do not substitute for, individual-level studies linking crash decedents to ambient heat and, where available, post-mortem findings.</w:t>
       </w:r>
     </w:p>
     <w:p>
@@ -1660,7 +1895,7 @@
         <w:pStyle w:val="Heading1"/>
       </w:pPr>
       <w:r>
-        <w:t>Data availability</w:t>
+        <w:t>Contributors</w:t>
       </w:r>
     </w:p>
     <w:p>
@@ -1668,7 +1903,71 @@
         <w:spacing w:after="120" w:line="480" w:lineRule="auto"/>
       </w:pPr>
       <w:r>
-        <w:t>All data are public: FARS, GHCN-Daily, CDC WONDER, FHWA/FRED, EIA and the Japanese NPA accident open data. Code and the reproduction pipeline (make all) are available in the project repository; all reported numbers are regenerated from source with no hard-coded values.</w:t>
+        <w:t>[PLACEHOLDER — replace before submission.] All authors contributed to the study design, data analysis, interpretation and drafting, and approved the final manuscript. [Specify each author's contribution and who verified the underlying data.]</w:t>
+      </w:r>
+    </w:p>
+    <w:p>
+      <w:pPr>
+        <w:pStyle w:val="Heading1"/>
+      </w:pPr>
+      <w:r>
+        <w:t>Declaration of interests</w:t>
+      </w:r>
+    </w:p>
+    <w:p>
+      <w:pPr>
+        <w:spacing w:after="120" w:line="480" w:lineRule="auto"/>
+      </w:pPr>
+      <w:r>
+        <w:t>[PLACEHOLDER — replace before submission.] We declare no competing interests.</w:t>
+      </w:r>
+    </w:p>
+    <w:p>
+      <w:pPr>
+        <w:pStyle w:val="Heading1"/>
+      </w:pPr>
+      <w:r>
+        <w:t>Role of the funding source</w:t>
+      </w:r>
+    </w:p>
+    <w:p>
+      <w:pPr>
+        <w:spacing w:after="120" w:line="480" w:lineRule="auto"/>
+      </w:pPr>
+      <w:r>
+        <w:t>[PLACEHOLDER — replace before submission.] There was no specific funding for this study. The corresponding author had full access to all the data and had final responsibility for the decision to submit for publication.</w:t>
+      </w:r>
+    </w:p>
+    <w:p>
+      <w:pPr>
+        <w:pStyle w:val="Heading1"/>
+      </w:pPr>
+      <w:r>
+        <w:t>Use of generative AI</w:t>
+      </w:r>
+    </w:p>
+    <w:p>
+      <w:pPr>
+        <w:spacing w:after="120" w:line="480" w:lineRule="auto"/>
+      </w:pPr>
+      <w:r>
+        <w:t>[PLACEHOLDER — confirm and adapt before submission.] Generative AI assistance was used to help develop analysis code and draft text; all methods, results and interpretations were verified by the authors, who take full responsibility for the content.</w:t>
+      </w:r>
+    </w:p>
+    <w:p>
+      <w:pPr>
+        <w:pStyle w:val="Heading1"/>
+      </w:pPr>
+      <w:r>
+        <w:t>Data sharing</w:t>
+      </w:r>
+    </w:p>
+    <w:p>
+      <w:pPr>
+        <w:spacing w:after="120" w:line="480" w:lineRule="auto"/>
+      </w:pPr>
+      <w:r>
+        <w:t>All data are public: FARS, GHCN-Daily, CDC WONDER, FHWA/FRED, EIA and the Japanese NPA accident open data (see References for sources). The complete analysis code and one-command reproduction pipeline (make all) are openly available in the project repository; every reported number, figure and table is regenerated from source with no hard-coded values.</w:t>
       </w:r>
     </w:p>
     <w:p>
@@ -1684,7 +1983,7 @@
         <w:spacing w:after="80"/>
       </w:pPr>
       <w:r>
-        <w:t>1. National Highway Traffic Safety Administration. Fatality Analysis Reporting System (FARS). US Department of Transportation. https://www.nhtsa.gov/research-data/fatality-analysis-reporting-system-fars</w:t>
+        <w:t>1. Gasparrini A, Guo Y, Hashizume M, et al. Mortality risk attributable to high and low ambient temperature: a multicountry observational study. Lancet 2015;386:369-75.</w:t>
       </w:r>
     </w:p>
     <w:p>
@@ -1692,7 +1991,7 @@
         <w:spacing w:after="80"/>
       </w:pPr>
       <w:r>
-        <w:t>2. National Police Agency of Japan. Traffic accident statistics open data. https://www.npa.go.jp/publications/statistics/koutsuu/opendata/</w:t>
+        <w:t>2. Basu R. High ambient temperature and mortality: a review of epidemiologic studies from 2001 to 2008. Environ Health 2009;8:40.</w:t>
       </w:r>
     </w:p>
     <w:p>
@@ -1700,7 +1999,7 @@
         <w:spacing w:after="80"/>
       </w:pPr>
       <w:r>
-        <w:t>3. Menne MJ, Durre I, Vose RS, Gleason BE, Houston TG. An overview of the Global Historical Climatology Network-Daily database. J Atmos Ocean Technol 2012;29:897-910.</w:t>
+        <w:t>3. National Highway Traffic Safety Administration. Fatality Analysis Reporting System (FARS). US Department of Transportation. https://www.nhtsa.gov/research-data/fatality-analysis-reporting-system-fars</w:t>
       </w:r>
     </w:p>
     <w:p>
@@ -1708,7 +2007,7 @@
         <w:spacing w:after="80"/>
       </w:pPr>
       <w:r>
-        <w:t>4. Gasparrini A, Guo Y, Hashizume M, et al. Mortality risk attributable to high and low ambient temperature: a multicountry observational study. Lancet 2015;386:369-75.</w:t>
+        <w:t>4. National Police Agency of Japan. Traffic accident statistics open data. https://www.npa.go.jp/publications/statistics/koutsuu/opendata/</w:t>
       </w:r>
     </w:p>
     <w:p>
@@ -1716,7 +2015,7 @@
         <w:spacing w:after="80"/>
       </w:pPr>
       <w:r>
-        <w:t>5. Basu R. High ambient temperature and mortality: a review of epidemiologic studies from 2001 to 2008. Environ Health 2009;8:40.</w:t>
+        <w:t>5. Menne MJ, Durre I, Vose RS, Gleason BE, Houston TG. An overview of the Global Historical Climatology Network-Daily database. J Atmos Ocean Technol 2012;29:897-910.</w:t>
       </w:r>
     </w:p>
     <w:p>

</xml_diff>

<commit_message>
Manuscript revision: sequential table numbering, age subgroup results, Word (OMML) equations, citation placement fix, em-dashes, submission zip
Co-Authored-By: Tatsuki Onishi <bougtoir@gmail.com>
</commit_message>
<xml_diff>
--- a/heat_accidents_mortality/output/manuscript/heat_crash_mortality.docx
+++ b/heat_accidents_mortality/output/manuscript/heat_crash_mortality.docx
@@ -179,7 +179,7 @@
         <w:spacing w:after="120" w:line="480" w:lineRule="auto"/>
       </w:pPr>
       <w:r>
-        <w:t xml:space="preserve">Heat waves are becoming more frequent under climate change, and ambient heat is an established driver of mortality </w:t>
+        <w:t>Heat waves are becoming more frequent under climate change, and ambient heat is an established driver of mortality.</w:t>
       </w:r>
       <w:r>
         <w:rPr>
@@ -188,7 +188,7 @@
         <w:t>1,2</w:t>
       </w:r>
       <w:r>
-        <w:t>. Occupational and driving activity do not stop during heat, so some fatal accidents plausibly involve heat-related impairment or frank heat illness. Traffic-crash deaths are of particular interest because decedents rarely undergo the post-mortem assessment that would identify a heat contribution, so any such contribution would be largely invisible in routine cause-of-death coding. We therefore ask whether days that are hotter than the local seasonal norm carry excess traffic-crash mortality, and how the magnitude compares with officially recorded direct-heat deaths. This is an ecological, population-level study whose aim is to gauge the potential societal burden of under-recognised heat illness -- the deaths that would be missing from official heat statistics -- rather than to diagnose heat illness in any individual crash.</w:t>
+        <w:t xml:space="preserve"> Occupational and driving activity do not stop during heat, so some fatal accidents plausibly involve heat-related impairment or frank heat illness. Traffic-crash deaths are of particular interest because decedents rarely undergo the post-mortem assessment that would identify a heat contribution, so any such contribution would be largely invisible in routine cause-of-death coding. We therefore ask whether days that are hotter than the local seasonal norm carry excess traffic-crash mortality, and how the magnitude compares with officially recorded direct-heat deaths. This is an ecological, population-level study whose aim is to gauge the potential societal burden of under-recognised heat illness—the deaths that would be missing from official heat statistics—rather than to diagnose heat illness in any individual crash.</w:t>
       </w:r>
     </w:p>
     <w:p>
@@ -201,10 +201,10 @@
     </w:p>
     <w:p>
       <w:pPr>
-        <w:spacing w:after="120" w:line="480" w:lineRule="auto"/>
+        <w:spacing w:after="40" w:line="480" w:lineRule="auto"/>
       </w:pPr>
       <w:r>
-        <w:t xml:space="preserve">We built daily panels of traffic-crash deaths by US state (FARS, 2016-2022) </w:t>
+        <w:t>We built daily panels of traffic-crash deaths by US state (FARS, 2016-2022)</w:t>
       </w:r>
       <w:r>
         <w:rPr>
@@ -213,7 +213,7 @@
         <w:t>3</w:t>
       </w:r>
       <w:r>
-        <w:t xml:space="preserve"> and by Japanese prefecture (NPA accident open data, 2019-2024) </w:t>
+        <w:t xml:space="preserve"> and by Japanese prefecture (NPA accident open data, 2019-2024).</w:t>
       </w:r>
       <w:r>
         <w:rPr>
@@ -222,7 +222,7 @@
         <w:t>4</w:t>
       </w:r>
       <w:r>
-        <w:t xml:space="preserve">. Daily mean temperature was derived from GHCN-Daily stations </w:t>
+        <w:t xml:space="preserve"> Daily mean temperature was taken from GHCN-Daily stations</w:t>
       </w:r>
       <w:r>
         <w:rPr>
@@ -231,15 +231,99 @@
         <w:t>5</w:t>
       </w:r>
       <w:r>
-        <w:t xml:space="preserve"> as the mean of TMAX and TMIN, aggregated to each spatial unit from the nearest reporting stations. For each unit we estimated a cyclic day-of-year climatology and defined the temperature anomaly as the observed minus the climatological temperature.</w:t>
+        <w:t xml:space="preserve"> as the mean of TMAX and TMIN, aggregated to each spatial unit from its nearest reporting stations. For every unit we estimated a cyclic day-of-year climatology and defined the temperature anomaly as the observed temperature minus that climatology,</w:t>
       </w:r>
+    </w:p>
+    <w:p>
+      <w:pPr>
+        <w:jc w:val="center"/>
+      </w:pPr>
+      <m:oMathPara>
+        <m:oMath>
+          <m:sSub>
+            <m:e>
+              <m:r>
+                <m:t xml:space="preserve">A</m:t>
+              </m:r>
+            </m:e>
+            <m:sub>
+              <m:r>
+                <m:t xml:space="preserve">u,t</m:t>
+              </m:r>
+            </m:sub>
+          </m:sSub>
+          <m:r>
+            <m:t xml:space="preserve"> = </m:t>
+          </m:r>
+          <m:sSub>
+            <m:e>
+              <m:r>
+                <m:t xml:space="preserve">T</m:t>
+              </m:r>
+            </m:e>
+            <m:sub>
+              <m:r>
+                <m:t xml:space="preserve">u,t</m:t>
+              </m:r>
+            </m:sub>
+          </m:sSub>
+          <m:r>
+            <m:t xml:space="preserve"> − </m:t>
+          </m:r>
+          <m:sSub>
+            <m:e>
+              <m:bar>
+                <m:barPr>
+                  <m:pos m:val="top"/>
+                </m:barPr>
+                <m:e>
+                  <m:r>
+                    <m:t xml:space="preserve">T</m:t>
+                  </m:r>
+                </m:e>
+              </m:bar>
+            </m:e>
+            <m:sub>
+              <m:r>
+                <m:t xml:space="preserve">u</m:t>
+              </m:r>
+            </m:sub>
+          </m:sSub>
+          <m:r>
+            <m:t xml:space="preserve">(</m:t>
+          </m:r>
+          <m:sSub>
+            <m:e>
+              <m:r>
+                <m:t xml:space="preserve">d</m:t>
+              </m:r>
+            </m:e>
+            <m:sub>
+              <m:r>
+                <m:t xml:space="preserve">t</m:t>
+              </m:r>
+            </m:sub>
+          </m:sSub>
+          <m:r>
+            <m:t xml:space="preserve">)</m:t>
+          </m:r>
+        </m:oMath>
+      </m:oMathPara>
     </w:p>
     <w:p>
       <w:pPr>
         <w:spacing w:after="120" w:line="480" w:lineRule="auto"/>
       </w:pPr>
       <w:r>
-        <w:t xml:space="preserve">Because absolute temperature is strongly confounded by the seasonal cycle of driving exposure, our primary model used the anomaly. We fitted quasi-Poisson distributed-lag models </w:t>
+        <w:t>for the anomaly A of spatial unit u on day t, where T is the observed daily mean temperature and the barred T is the day-of-year climatology d(t) for that unit.</w:t>
+      </w:r>
+    </w:p>
+    <w:p>
+      <w:pPr>
+        <w:spacing w:after="40" w:line="480" w:lineRule="auto"/>
+      </w:pPr>
+      <w:r>
+        <w:t>Absolute temperature is strongly confounded by the seasonal cycle of driving exposure, so our primary model used the anomaly. We fitted a quasi-Poisson distributed-lag model</w:t>
       </w:r>
       <w:r>
         <w:rPr>
@@ -248,7 +332,150 @@
         <w:t>6</w:t>
       </w:r>
       <w:r>
-        <w:t xml:space="preserve"> in which the exposure entered through a constant-free natural cubic spline within three lag windows (same-day, 1-3 days, 4-10 days), adjusting for spatial fixed effects, region-specific season (natural spline of day of year), a long-term time trend and day of week. Overdispersion was accommodated with a quasi-Poisson dispersion parameter. Net heat-attributable deaths were computed by the method of Gasparrini and Leone </w:t>
+        <w:t xml:space="preserve"> of the form</w:t>
+      </w:r>
+    </w:p>
+    <w:p>
+      <w:pPr>
+        <w:jc w:val="center"/>
+      </w:pPr>
+      <m:oMathPara>
+        <m:oMath>
+          <m:r>
+            <m:t xml:space="preserve">log E(</m:t>
+          </m:r>
+          <m:sSub>
+            <m:e>
+              <m:r>
+                <m:t xml:space="preserve">Y</m:t>
+              </m:r>
+            </m:e>
+            <m:sub>
+              <m:r>
+                <m:t xml:space="preserve">u,t</m:t>
+              </m:r>
+            </m:sub>
+          </m:sSub>
+          <m:r>
+            <m:t xml:space="preserve">) = </m:t>
+          </m:r>
+          <m:nary>
+            <m:naryPr>
+              <m:chr m:val="∑"/>
+              <m:limLoc m:val="subSup"/>
+              <m:supHide m:val="1"/>
+            </m:naryPr>
+            <m:sub>
+              <m:r>
+                <m:t xml:space="preserve">k</m:t>
+              </m:r>
+            </m:sub>
+            <m:sup/>
+            <m:e>
+              <m:sSub>
+                <m:e>
+                  <m:r>
+                    <m:t xml:space="preserve">f</m:t>
+                  </m:r>
+                </m:e>
+                <m:sub>
+                  <m:r>
+                    <m:t xml:space="preserve">k</m:t>
+                  </m:r>
+                </m:sub>
+              </m:sSub>
+              <m:r>
+                <m:t xml:space="preserve">(</m:t>
+              </m:r>
+              <m:sSub>
+                <m:e>
+                  <m:r>
+                    <m:t xml:space="preserve">A</m:t>
+                  </m:r>
+                </m:e>
+                <m:sub>
+                  <m:r>
+                    <m:t xml:space="preserve">u,t</m:t>
+                  </m:r>
+                </m:sub>
+              </m:sSub>
+              <m:r>
+                <m:t xml:space="preserve">)</m:t>
+              </m:r>
+            </m:e>
+          </m:nary>
+          <m:r>
+            <m:t xml:space="preserve"> + </m:t>
+          </m:r>
+          <m:sSub>
+            <m:e>
+              <m:r>
+                <m:t xml:space="preserve">α</m:t>
+              </m:r>
+            </m:e>
+            <m:sub>
+              <m:r>
+                <m:t xml:space="preserve">u</m:t>
+              </m:r>
+            </m:sub>
+          </m:sSub>
+          <m:r>
+            <m:t xml:space="preserve"> + </m:t>
+          </m:r>
+          <m:sSub>
+            <m:e>
+              <m:r>
+                <m:t xml:space="preserve">s</m:t>
+              </m:r>
+            </m:e>
+            <m:sub>
+              <m:r>
+                <m:t xml:space="preserve">r(u)</m:t>
+              </m:r>
+            </m:sub>
+          </m:sSub>
+          <m:r>
+            <m:t xml:space="preserve">(</m:t>
+          </m:r>
+          <m:sSub>
+            <m:e>
+              <m:r>
+                <m:t xml:space="preserve">d</m:t>
+              </m:r>
+            </m:e>
+            <m:sub>
+              <m:r>
+                <m:t xml:space="preserve">t</m:t>
+              </m:r>
+            </m:sub>
+          </m:sSub>
+          <m:r>
+            <m:t xml:space="preserve">)</m:t>
+          </m:r>
+          <m:r>
+            <m:t xml:space="preserve"> + h(t) + </m:t>
+          </m:r>
+          <m:sSub>
+            <m:e>
+              <m:r>
+                <m:t xml:space="preserve">δ</m:t>
+              </m:r>
+            </m:e>
+            <m:sub>
+              <m:r>
+                <m:t xml:space="preserve">dow(t)</m:t>
+              </m:r>
+            </m:sub>
+          </m:sSub>
+        </m:oMath>
+      </m:oMathPara>
+    </w:p>
+    <w:p>
+      <w:pPr>
+        <w:spacing w:after="120" w:line="480" w:lineRule="auto"/>
+      </w:pPr>
+      <w:r>
+        <w:t>where Y is the daily crash-death count, the fₖ are constant-free natural cubic splines of the anomaly within three lag windows (same day, 1-3 days, 4-10 days) summed over k, αᵤ are spatial fixed effects, s is a region-specific cyclic seasonal spline of day of year, h a long-term time trend and δ a day-of-week effect. Overdispersion was handled with a quasi-Poisson dispersion parameter. Net heat-attributable deaths were computed by the method of Gasparrini and Leone</w:t>
       </w:r>
       <w:r>
         <w:rPr>
@@ -257,7 +484,7 @@
         <w:t>7</w:t>
       </w:r>
       <w:r>
-        <w:t xml:space="preserve"> with Monte Carlo (MC) confidence intervals (CIs). As a sensitivity analysis for the US we added national vehicle-miles travelled (VMT) </w:t>
+        <w:t xml:space="preserve"> with Monte Carlo (MC) confidence intervals (CIs). As a sensitivity analysis for the US we added national vehicle-miles travelled (VMT)</w:t>
       </w:r>
       <w:r>
         <w:rPr>
@@ -266,7 +493,7 @@
         <w:t>8</w:t>
       </w:r>
       <w:r>
-        <w:t xml:space="preserve"> and finished-motor-gasoline product supplied </w:t>
+        <w:t xml:space="preserve"> and finished-motor-gasoline product supplied</w:t>
       </w:r>
       <w:r>
         <w:rPr>
@@ -275,7 +502,7 @@
         <w:t>9</w:t>
       </w:r>
       <w:r>
-        <w:t xml:space="preserve"> as activity proxies. Officially recorded direct-heat deaths (International Classification of Diseases, 10th revision [ICD-10] code X30) were obtained from CDC WONDER </w:t>
+        <w:t xml:space="preserve"> as activity proxies. Officially recorded direct-heat deaths (International Classification of Diseases, 10th revision [ICD-10] code X30) were obtained from CDC WONDER.</w:t>
       </w:r>
       <w:r>
         <w:rPr>
@@ -284,7 +511,7 @@
         <w:t>10</w:t>
       </w:r>
       <w:r>
-        <w:t>. In three further US analyses we (i) refitted the same-day model within crash-hour bands to test whether the excess concentrates in the hottest hours; (ii) refitted it by road-user type (vehicle occupant, motorcyclist, pedestrian, cyclist) and age band from FARS person records, as a mechanistic and vulnerability analysis; and (iii) projected the additional crash deaths implied by uniform warming of the daily temperature distribution (+1, +2, +3 C), holding activity and baseline rates constant. All data are public and the full pipeline is reproducible from source (see Data sharing). Reporting follows the Strengthening the Reporting of Observational Studies in Epidemiology (STROBE) guideline (checklist provided).</w:t>
+        <w:t xml:space="preserve"> In three further US analyses we (i) refitted the same-day model within crash-hour bands to test whether the excess concentrates in the hottest hours; (ii) refitted it by road-user type (vehicle occupant, motorcyclist, pedestrian, cyclist) and age band from FARS person records, as a mechanistic and vulnerability analysis; and (iii) projected the additional crash deaths implied by uniform warming of the daily temperature distribution (+1, +2, +3 C), holding activity and baseline rates constant. All data are public and the full pipeline is reproducible from source (see Data sharing). Reporting follows the Strengthening the Reporting of Observational Studies in Epidemiology (STROBE) guideline (checklist provided).</w:t>
       </w:r>
     </w:p>
     <w:p>
@@ -880,7 +1107,7 @@
         <w:spacing w:after="120" w:line="480" w:lineRule="auto"/>
       </w:pPr>
       <w:r>
-        <w:t xml:space="preserve">Two exploratory analyses were consistent with a heat mechanism, although neither can exclude residual confounding. First, the same-day excess differed by road-user exposure (Fig. 4; Table 4): the effect was small for enclosed, often air-conditioned, vehicle occupants (RR 1.050 (1.016-1.085)) but larger for open-air users -- motorcyclists (RR 2.141 (2.000-2.292)), pedestrians (RR 1.213 (1.145-1.286)) and cyclists (RR 1.237 (1.032-1.484)) -- a gradient consistent with direct bodily heat exposure and physical exertion </w:t>
+        <w:t>Two exploratory analyses were consistent with a heat mechanism, although neither can exclude residual confounding. First, the same-day excess differed by road-user exposure (Fig. 4; Table 3): the effect was small for enclosed, often air-conditioned, vehicle occupants (RR 1.050 (1.016-1.085)) but larger for open-air users—motorcyclists (RR 2.141 (2.000-2.292)), pedestrians (RR 1.213 (1.145-1.286)) and cyclists (RR 1.237 (1.032-1.484))—a gradient consistent with direct bodily heat exposure and physical exertion,</w:t>
       </w:r>
       <w:r>
         <w:rPr>
@@ -889,7 +1116,7 @@
         <w:t>11</w:t>
       </w:r>
       <w:r>
-        <w:t>, though it could also partly reflect greater discretionary open-air travel (motorcycling, cycling, walking) on hotter-than-normal days, which our aggregate activity proxies do not capture by mode. Second, the excess was largest for crashes in the hottest part of the day (12-17 h; RR 1.212 (1.155-1.272)) and weakest in the cool morning (06-11 h; RR 1.062 (1.000-1.127)); the overnight band was also elevated (00-05 h; RR 1.179 (1.110-1.253)), so the diurnal pattern is not a clean daytime-only gradient (Fig. 5). These road-user, age and time-of-day analyses are hypothesis-generating: they involve multiple unadjusted comparisons and are not individual-level tests of susceptibility or mechanism.</w:t>
+        <w:t xml:space="preserve"> though it could also partly reflect greater discretionary open-air travel (motorcycling, cycling, walking) on hotter-than-normal days, which our aggregate activity proxies do not capture by mode. Across age bands the excess was of similar size (age &lt;25 y RR 1.123 (1.059-1.191); 25-64 y RR 1.177 (1.140-1.216); 65+ y RR 1.167 (1.104-1.234); Table 3), giving no clear age gradient. Second, the excess was largest for crashes in the hottest part of the day (12-17 h; RR 1.212 (1.155-1.272)) and weakest in the cool morning (06-11 h; RR 1.062 (1.000-1.127)); the overnight band was also elevated (00-05 h; RR 1.179 (1.110-1.253)), so the diurnal pattern is not a clean daytime-only gradient (Fig. 5). These road-user, age and time-of-day analyses are hypothesis-generating: they involve multiple unadjusted comparisons and are not individual-level tests of susceptibility or mechanism.</w:t>
       </w:r>
     </w:p>
     <w:p/>
@@ -943,7 +1170,7 @@
         <w:t xml:space="preserve">Figure 4. </w:t>
       </w:r>
       <w:r>
-        <w:t>United States same-day rate ratio of crash death for a +9 C anomaly by road-user type. Open-air users (motorcyclists, pedestrians, cyclists) show much larger heat effects than enclosed, often air-conditioned, vehicle occupants -- a gradient that tracks direct heat exposure rather than driving volume.</w:t>
+        <w:t>United States same-day rate ratio of crash death for a +9 C anomaly by road-user type. Open-air users (motorcyclists, pedestrians, cyclists) show much larger heat effects than enclosed, often air-conditioned, vehicle occupants—a gradient that tracks direct heat exposure rather than driving volume.</w:t>
       </w:r>
     </w:p>
     <w:p/>
@@ -1010,7 +1237,7 @@
         <w:rPr>
           <w:b/>
         </w:rPr>
-        <w:t xml:space="preserve">Table 4. </w:t>
+        <w:t xml:space="preserve">Table 3. </w:t>
       </w:r>
       <w:r>
         <w:t>United States same-day rate ratio of crash death for a +9 C anomaly, by road-user type and age band (vulnerability analysis).</w:t>
@@ -1299,7 +1526,7 @@
         <w:spacing w:after="120" w:line="480" w:lineRule="auto"/>
       </w:pPr>
       <w:r>
-        <w:t>Net heat-attributable crash deaths were 513 per year (95% CI 410-615), an attributable fraction of 1.33% (Fig. 6; Table 3). This is of the same order as the 527 officially recorded direct-heat deaths per year (ICD-10 X30, 2016-2020; Fig. 7), so a heat contribution to crash deaths of a magnitude comparable to all recorded direct-heat mortality would be entirely absent from cause-of-death statistics.</w:t>
+        <w:t>Net heat-attributable crash deaths were 513 per year (95% CI 410-615), an attributable fraction of 1.33% (Fig. 6; Table 4). This is of the same order as the 527 officially recorded direct-heat deaths per year (ICD-10 X30, 2016-2020; Fig. 7), so a heat contribution to road deaths on the scale of all recorded direct-heat mortality could go unrecorded in cause-of-death statistics.</w:t>
       </w:r>
     </w:p>
     <w:p/>
@@ -1420,7 +1647,7 @@
         <w:rPr>
           <w:b/>
         </w:rPr>
-        <w:t xml:space="preserve">Table 3. </w:t>
+        <w:t xml:space="preserve">Table 4. </w:t>
       </w:r>
       <w:r>
         <w:t>United States net heat-attributable crash deaths versus officially recorded direct-heat deaths.</w:t>
@@ -1537,7 +1764,7 @@
         <w:spacing w:after="120" w:line="480" w:lineRule="auto"/>
       </w:pPr>
       <w:r>
-        <w:t xml:space="preserve">To gauge the trajectory under continued warming, we applied the estimated anomaly exposure-response to uniformly warmer daily temperatures, holding driving activity and baseline rates constant </w:t>
+        <w:t>To gauge the trajectory under continued warming, we applied the estimated anomaly exposure-response to uniformly warmer daily temperatures, holding driving activity and baseline rates constant.</w:t>
       </w:r>
       <w:r>
         <w:rPr>
@@ -1546,7 +1773,7 @@
         <w:t>12</w:t>
       </w:r>
       <w:r>
-        <w:t>. A uniform +1 C shift projected 339 additional US crash deaths per year (95% CI 250-428), rising to 983 (644-1356) at +3 C (Fig. 8; Table 5). These are scenario projections, not observed quantities, and assume the anomaly response is stable under a warmer mean climate.</w:t>
+        <w:t xml:space="preserve"> A uniform +1 C shift projected 339 additional US crash deaths per year (95% CI 250-428), rising to 983 (644-1356) at +3 C (Fig. 8; Table 5). These are scenario projections, not observed quantities, and assume the anomaly response is stable under a warmer mean climate.</w:t>
       </w:r>
     </w:p>
     <w:p/>
@@ -1855,7 +2082,7 @@
         <w:spacing w:after="120" w:line="480" w:lineRule="auto"/>
       </w:pPr>
       <w:r>
-        <w:t>Days hotter than the local seasonal norm are associated with an acute, same-day excess of US traffic-crash deaths that is robust to activity confounding and is comparable in magnitude to all officially recorded direct-heat mortality. This is consistent with the hypothesis that heat-related impairment and under-recognised heat illness contribute to road deaths without appearing in cause-of-death data. The 1-3 day deficit indicates that part of the acute excess reflects short-term displacement, so the net annual burden is smaller than the same-day spike alone would imply.</w:t>
+        <w:t>Days hotter than the local seasonal norm are associated with an acute, same-day excess of US traffic-crash deaths that is not explained by aggregate driving activity and is comparable in magnitude to all officially recorded direct-heat mortality. This is consistent with the hypothesis that heat-related impairment and under-recognised heat illness contribute to road deaths without appearing in cause-of-death data. The 1-3 day deficit indicates that part of the acute excess reflects short-term displacement, so the net annual burden is smaller than the same-day spike alone would imply.</w:t>
       </w:r>
     </w:p>
     <w:p>
@@ -1863,7 +2090,7 @@
         <w:spacing w:after="120" w:line="480" w:lineRule="auto"/>
       </w:pPr>
       <w:r>
-        <w:t>Two patterns are consistent with a direct heat mechanism rather than with confounding by aggregate driving volume. The excess was graded by bodily heat exposure -- minimal for enclosed, frequently air-conditioned vehicle occupants but several-fold larger for motorcyclists, pedestrians and cyclists, who are directly exposed and often physically exerting -- and it was largest in the hottest hours of the day. Both are expected if heat degrades psychomotor and cognitive performance. We caution, however, that these gradients are not proof of mechanism: open-air travel is itself weather-elastic, so more motorcycling, cycling and walking on hotter-than-normal days could inflate the open-air estimates through greater exposure rather than physiology, and our activity proxies are national and not mode-specific. Applied to a warmer mean climate, the same exposure-response implies hundreds of additional US crash deaths per year per degree of warming; because these deaths would continue to be coded as ordinary crashes, the societal heat burden they represent would remain invisible to heat-mortality surveillance.</w:t>
+        <w:t>Two features of the data point towards a direct heat effect rather than confounding by overall driving volume. The excess was graded by bodily heat exposure—minimal for enclosed, frequently air-conditioned vehicle occupants but several-fold larger for motorcyclists, pedestrians and cyclists, who are directly exposed and often physically exerting—and it was largest in the hottest hours of the day. Both are what one would expect if heat degrades psychomotor and cognitive performance. These gradients are not proof of mechanism, however: open-air travel is itself weather-elastic, so more motorcycling, cycling and walking on hotter-than-normal days could inflate the open-air estimates through greater exposure rather than physiology, and our activity proxies are national and not mode-specific. Applied to a warmer mean climate, the same exposure-response implies hundreds of additional US crash deaths per year per degree of warming; because these deaths would continue to be coded as ordinary crashes, the societal heat burden they represent would remain invisible to heat-mortality surveillance.</w:t>
       </w:r>
     </w:p>
     <w:p>

</xml_diff>

<commit_message>
AAP submission: fix figure/table placement order and clarify abstract RR labels
Co-Authored-By: Tatsuki Onishi <bougtoir@gmail.com>
</commit_message>
<xml_diff>
--- a/heat_accidents_mortality/output/manuscript/heat_crash_mortality.docx
+++ b/heat_accidents_mortality/output/manuscript/heat_crash_mortality.docx
@@ -85,7 +85,7 @@
         <w:t xml:space="preserve">Findings </w:t>
       </w:r>
       <w:r>
-        <w:t>In the USA (270,497 crash deaths), a +9°C anomaly was associated with higher same-day crash mortality, RR 1.165 (95% CI 1.134-1.196), essentially unchanged after adjusting for driving activity (RR 1.162). The excess was larger for open-air users (motorcyclists 2.141, pedestrians 1.213) than vehicle occupants (1.050). Net heat-attributable deaths were 513 per year (1.33%), similar to 527 officially recorded direct-heat deaths (ICD-10 X30); +1 to +3°C warming projected 339-983 additional deaths per year. An exploratory Japan comparison (11,576 deaths) found the data too sparse for a precise estimate.</w:t>
+        <w:t>In the USA (270,497 crash deaths), a +9°C anomaly was associated with higher same-day crash mortality, RR 1.165 (95% CI 1.134-1.196), essentially unchanged after adjusting for driving activity (RR 1.162). The excess was larger for open-air users (motorcyclists RR 2.141, pedestrians RR 1.213) than vehicle occupants (RR 1.050). Net heat-attributable deaths were 513 per year (1.33%), similar to 527 recorded direct-heat deaths (ICD-10 X30); +1 to +3°C warming projected 339-983 additional deaths per year. An exploratory Japan comparison (11,576 deaths) found the data too sparse for a precise estimate.</w:t>
       </w:r>
     </w:p>
     <w:p>
@@ -1174,61 +1174,6 @@
       </w:r>
     </w:p>
     <w:p/>
-    <w:p/>
-    <w:p>
-      <w:pPr>
-        <w:jc w:val="center"/>
-      </w:pPr>
-      <w:r>
-        <w:drawing>
-          <wp:inline xmlns:a="http://schemas.openxmlformats.org/drawingml/2006/main" xmlns:pic="http://schemas.openxmlformats.org/drawingml/2006/picture">
-            <wp:extent cx="5120640" cy="3874497"/>
-            <wp:docPr id="5" name="Picture 5"/>
-            <wp:cNvGraphicFramePr>
-              <a:graphicFrameLocks noChangeAspect="1"/>
-            </wp:cNvGraphicFramePr>
-            <a:graphic>
-              <a:graphicData uri="http://schemas.openxmlformats.org/drawingml/2006/picture">
-                <pic:pic>
-                  <pic:nvPicPr>
-                    <pic:cNvPr id="0" name="fig_us_timeofday.png"/>
-                    <pic:cNvPicPr/>
-                  </pic:nvPicPr>
-                  <pic:blipFill>
-                    <a:blip r:embed="rId13"/>
-                    <a:stretch>
-                      <a:fillRect/>
-                    </a:stretch>
-                  </pic:blipFill>
-                  <pic:spPr>
-                    <a:xfrm>
-                      <a:off x="0" y="0"/>
-                      <a:ext cx="5120640" cy="3874497"/>
-                    </a:xfrm>
-                    <a:prstGeom prst="rect"/>
-                  </pic:spPr>
-                </pic:pic>
-              </a:graphicData>
-            </a:graphic>
-          </wp:inline>
-        </w:drawing>
-      </w:r>
-    </w:p>
-    <w:p>
-      <w:pPr>
-        <w:spacing w:before="280"/>
-      </w:pPr>
-      <w:r>
-        <w:rPr>
-          <w:b/>
-        </w:rPr>
-        <w:t xml:space="preserve">Figure 5. </w:t>
-      </w:r>
-      <w:r>
-        <w:t>United States same-day rate ratio of crash death for a +9 °C anomaly by crash hour of day. The excess is largest for crashes in the hottest part of the day (12-17 h) and weakest in the cool morning (06-11 h).</w:t>
-      </w:r>
-    </w:p>
-    <w:p/>
     <w:p>
       <w:pPr>
         <w:spacing w:before="280"/>
@@ -1521,6 +1466,61 @@
       </w:tr>
     </w:tbl>
     <w:p/>
+    <w:p/>
+    <w:p>
+      <w:pPr>
+        <w:jc w:val="center"/>
+      </w:pPr>
+      <w:r>
+        <w:drawing>
+          <wp:inline xmlns:a="http://schemas.openxmlformats.org/drawingml/2006/main" xmlns:pic="http://schemas.openxmlformats.org/drawingml/2006/picture">
+            <wp:extent cx="5120640" cy="3874497"/>
+            <wp:docPr id="5" name="Picture 5"/>
+            <wp:cNvGraphicFramePr>
+              <a:graphicFrameLocks noChangeAspect="1"/>
+            </wp:cNvGraphicFramePr>
+            <a:graphic>
+              <a:graphicData uri="http://schemas.openxmlformats.org/drawingml/2006/picture">
+                <pic:pic>
+                  <pic:nvPicPr>
+                    <pic:cNvPr id="0" name="fig_us_timeofday.png"/>
+                    <pic:cNvPicPr/>
+                  </pic:nvPicPr>
+                  <pic:blipFill>
+                    <a:blip r:embed="rId13"/>
+                    <a:stretch>
+                      <a:fillRect/>
+                    </a:stretch>
+                  </pic:blipFill>
+                  <pic:spPr>
+                    <a:xfrm>
+                      <a:off x="0" y="0"/>
+                      <a:ext cx="5120640" cy="3874497"/>
+                    </a:xfrm>
+                    <a:prstGeom prst="rect"/>
+                  </pic:spPr>
+                </pic:pic>
+              </a:graphicData>
+            </a:graphic>
+          </wp:inline>
+        </w:drawing>
+      </w:r>
+    </w:p>
+    <w:p>
+      <w:pPr>
+        <w:spacing w:before="280"/>
+      </w:pPr>
+      <w:r>
+        <w:rPr>
+          <w:b/>
+        </w:rPr>
+        <w:t xml:space="preserve">Figure 5. </w:t>
+      </w:r>
+      <w:r>
+        <w:t>United States same-day rate ratio of crash death for a +9 °C anomaly by crash hour of day. The excess is largest for crashes in the hottest part of the day (12-17 h) and weakest in the cool morning (06-11 h).</w:t>
+      </w:r>
+    </w:p>
+    <w:p/>
     <w:p>
       <w:pPr>
         <w:spacing w:after="120" w:line="480" w:lineRule="auto"/>
@@ -1581,61 +1581,6 @@
       </w:r>
       <w:r>
         <w:t>United States estimated net heat-attributable crash deaths per year, 2016-2022.</w:t>
-      </w:r>
-    </w:p>
-    <w:p/>
-    <w:p/>
-    <w:p>
-      <w:pPr>
-        <w:jc w:val="center"/>
-      </w:pPr>
-      <w:r>
-        <w:drawing>
-          <wp:inline xmlns:a="http://schemas.openxmlformats.org/drawingml/2006/main" xmlns:pic="http://schemas.openxmlformats.org/drawingml/2006/picture">
-            <wp:extent cx="5120640" cy="3889368"/>
-            <wp:docPr id="7" name="Picture 7"/>
-            <wp:cNvGraphicFramePr>
-              <a:graphicFrameLocks noChangeAspect="1"/>
-            </wp:cNvGraphicFramePr>
-            <a:graphic>
-              <a:graphicData uri="http://schemas.openxmlformats.org/drawingml/2006/picture">
-                <pic:pic>
-                  <pic:nvPicPr>
-                    <pic:cNvPr id="0" name="fig5_hidden_vs_official.png"/>
-                    <pic:cNvPicPr/>
-                  </pic:nvPicPr>
-                  <pic:blipFill>
-                    <a:blip r:embed="rId15"/>
-                    <a:stretch>
-                      <a:fillRect/>
-                    </a:stretch>
-                  </pic:blipFill>
-                  <pic:spPr>
-                    <a:xfrm>
-                      <a:off x="0" y="0"/>
-                      <a:ext cx="5120640" cy="3889368"/>
-                    </a:xfrm>
-                    <a:prstGeom prst="rect"/>
-                  </pic:spPr>
-                </pic:pic>
-              </a:graphicData>
-            </a:graphic>
-          </wp:inline>
-        </w:drawing>
-      </w:r>
-    </w:p>
-    <w:p>
-      <w:pPr>
-        <w:spacing w:before="280"/>
-      </w:pPr>
-      <w:r>
-        <w:rPr>
-          <w:b/>
-        </w:rPr>
-        <w:t xml:space="preserve">Figure 7. </w:t>
-      </w:r>
-      <w:r>
-        <w:t>United States comparison of estimated net heat-attributable crash deaths per year with officially recorded direct-heat deaths (ICD-10 X30) from CDC WONDER.</w:t>
       </w:r>
     </w:p>
     <w:p/>
@@ -1758,6 +1703,61 @@
         </w:tc>
       </w:tr>
     </w:tbl>
+    <w:p/>
+    <w:p/>
+    <w:p>
+      <w:pPr>
+        <w:jc w:val="center"/>
+      </w:pPr>
+      <w:r>
+        <w:drawing>
+          <wp:inline xmlns:a="http://schemas.openxmlformats.org/drawingml/2006/main" xmlns:pic="http://schemas.openxmlformats.org/drawingml/2006/picture">
+            <wp:extent cx="5120640" cy="3889368"/>
+            <wp:docPr id="7" name="Picture 7"/>
+            <wp:cNvGraphicFramePr>
+              <a:graphicFrameLocks noChangeAspect="1"/>
+            </wp:cNvGraphicFramePr>
+            <a:graphic>
+              <a:graphicData uri="http://schemas.openxmlformats.org/drawingml/2006/picture">
+                <pic:pic>
+                  <pic:nvPicPr>
+                    <pic:cNvPr id="0" name="fig5_hidden_vs_official.png"/>
+                    <pic:cNvPicPr/>
+                  </pic:nvPicPr>
+                  <pic:blipFill>
+                    <a:blip r:embed="rId15"/>
+                    <a:stretch>
+                      <a:fillRect/>
+                    </a:stretch>
+                  </pic:blipFill>
+                  <pic:spPr>
+                    <a:xfrm>
+                      <a:off x="0" y="0"/>
+                      <a:ext cx="5120640" cy="3889368"/>
+                    </a:xfrm>
+                    <a:prstGeom prst="rect"/>
+                  </pic:spPr>
+                </pic:pic>
+              </a:graphicData>
+            </a:graphic>
+          </wp:inline>
+        </w:drawing>
+      </w:r>
+    </w:p>
+    <w:p>
+      <w:pPr>
+        <w:spacing w:before="280"/>
+      </w:pPr>
+      <w:r>
+        <w:rPr>
+          <w:b/>
+        </w:rPr>
+        <w:t xml:space="preserve">Figure 7. </w:t>
+      </w:r>
+      <w:r>
+        <w:t>United States comparison of estimated net heat-attributable crash deaths per year with officially recorded direct-heat deaths (ICD-10 X30) from CDC WONDER.</w:t>
+      </w:r>
+    </w:p>
     <w:p/>
     <w:p>
       <w:pPr>

</xml_diff>

<commit_message>
fix AAP manuscript: grammar, displacement wording, activity-control CI, ethics statement
Co-Authored-By: Tatsuki Onishi <bougtoir@gmail.com>
</commit_message>
<xml_diff>
--- a/heat_accidents_mortality/output/manuscript/heat_crash_mortality.docx
+++ b/heat_accidents_mortality/output/manuscript/heat_crash_mortality.docx
@@ -57,7 +57,7 @@
         <w:t xml:space="preserve">Background </w:t>
       </w:r>
       <w:r>
-        <w:t>Ambient heat is an established risk factor for mortality, and heat waves are increasing. Because driving continues in heat, some fatal crashes may involve heat-related impairment or undiagnosed heat illness that goes unrecorded. We estimated the population-level traffic-crash mortality burden of these under-recognised effects in the USA and Japan.</w:t>
+        <w:t>Ambient heat is an established risk factor for mortality, and heat waves are increasing. Because driving continues in heat, some fatal crashes may involve heat-related impairment or unrecorded heat illness. We estimated the US traffic-crash mortality burden and explored the same question in Japan.</w:t>
       </w:r>
     </w:p>
     <w:p>
@@ -85,7 +85,7 @@
         <w:t xml:space="preserve">Findings </w:t>
       </w:r>
       <w:r>
-        <w:t>In the USA (270,497 crash deaths), a +9°C anomaly was associated with higher same-day crash mortality, RR 1.165 (95% CI 1.134-1.196), essentially unchanged after adjusting for driving activity (RR 1.162). The excess was larger for open-air users (motorcyclists RR 2.141, pedestrians RR 1.213) than vehicle occupants (RR 1.050). Net heat-attributable deaths were 513 per year (1.33%), similar to 527 recorded direct-heat deaths (ICD-10 X30); +1 to +3°C warming projected 339-983 additional deaths per year. An exploratory Japan comparison (11,576 deaths) found the data too sparse for a precise estimate.</w:t>
+        <w:t>In the USA (270,497 crash deaths), a +9°C anomaly was associated with higher same-day crash mortality, RR 1.165 (95% CI 1.134-1.196), and the association remained positive after adjustment for driving activity, RR 1.162 (95% CI 1.132-1.193). The excess was larger for open-air users (motorcyclists RR 2.141, pedestrians RR 1.213) than vehicle occupants (RR 1.050). Net heat-attributable deaths were 513 per year (1.33%), similar to 527 recorded direct-heat deaths (ICD-10 X30); +1 to +3°C warming projected 339-983 additional deaths per year. An exploratory Japan comparison (11,576 deaths) found the data too sparse for a precise estimate.</w:t>
       </w:r>
     </w:p>
     <w:p>
@@ -99,7 +99,7 @@
         <w:t xml:space="preserve">Interpretation </w:t>
       </w:r>
       <w:r>
-        <w:t>Unusually hot days are associated with an acute excess of US traffic-crash deaths comparable to all recorded direct-heat mortality, concentrated in heat-exposed road users and projected to grow with warming. This is consistent with an under-recognised heat contribution, but the study cannot establish heat illness in any individual crash and the open-air gradient may partly reflect weather-related activity. The findings suggest heat-aware road safety and climate adaptation planning could address an uncounted burden.</w:t>
+        <w:t>Unusually hot days are associated with an acute excess of US crash deaths comparable to recorded direct-heat mortality, concentrated in heat-exposed road users and projected to grow with warming. This is consistent with an under-recognised heat contribution, but the study cannot establish heat illness in any individual crash and the open-air gradient may partly reflect weather-related activity. The findings suggest heat-aware road safety and climate adaptation planning could address an uncounted burden.</w:t>
       </w:r>
     </w:p>
     <w:p>
@@ -188,6 +188,15 @@
         <w:t>1,2</w:t>
       </w:r>
       <w:r>
+        <w:t xml:space="preserve"> Recent syntheses also link higher ambient temperature to increased road traffic accidents and injuries.</w:t>
+      </w:r>
+      <w:r>
+        <w:rPr>
+          <w:vertAlign w:val="superscript"/>
+        </w:rPr>
+        <w:t>3,4</w:t>
+      </w:r>
+      <w:r>
         <w:t xml:space="preserve"> Occupational and driving activity do not stop during heat, so some fatal accidents plausibly involve heat-related impairment or overt heat illness. Traffic-crash deaths are of particular interest because decedents rarely undergo the post-mortem assessment that would identify a heat contribution, so any such contribution would be largely invisible in routine cause-of-death coding. We therefore ask whether days that are hotter than the local seasonal norm carry excess traffic-crash mortality, and how the magnitude compares with officially recorded direct-heat deaths. This is an ecological, population-level study whose aim is to gauge the potential societal burden of under-recognised heat illness—the deaths that would be missing from official heat statistics—rather than to diagnose heat illness in any individual crash. If population-level heat contributes to road deaths, heat-aware road safety messaging and occupational protections for outdoor riders and drivers could reduce a burden currently invisible to both heat-mortality and road-safety surveillance.</w:t>
       </w:r>
     </w:p>
@@ -210,7 +219,7 @@
         <w:rPr>
           <w:vertAlign w:val="superscript"/>
         </w:rPr>
-        <w:t>3</w:t>
+        <w:t>5</w:t>
       </w:r>
       <w:r>
         <w:t xml:space="preserve"> and by Japanese prefecture (NPA accident open data, 2019-2024).</w:t>
@@ -219,7 +228,7 @@
         <w:rPr>
           <w:vertAlign w:val="superscript"/>
         </w:rPr>
-        <w:t>4</w:t>
+        <w:t>6</w:t>
       </w:r>
       <w:r>
         <w:t xml:space="preserve"> Daily mean temperature was taken from GHCN-Daily stations</w:t>
@@ -228,7 +237,7 @@
         <w:rPr>
           <w:vertAlign w:val="superscript"/>
         </w:rPr>
-        <w:t>5</w:t>
+        <w:t>7</w:t>
       </w:r>
       <w:r>
         <w:t xml:space="preserve"> as the mean of TMAX and TMIN, aggregated to each spatial unit from its nearest reporting stations. For every unit we estimated a cyclic day-of-year climatology and defined the temperature anomaly as the observed temperature minus that climatology,</w:t>
@@ -329,7 +338,7 @@
         <w:rPr>
           <w:vertAlign w:val="superscript"/>
         </w:rPr>
-        <w:t>6</w:t>
+        <w:t>8</w:t>
       </w:r>
       <w:r>
         <w:t xml:space="preserve"> of the form</w:t>
@@ -481,7 +490,7 @@
         <w:rPr>
           <w:vertAlign w:val="superscript"/>
         </w:rPr>
-        <w:t>7</w:t>
+        <w:t>9</w:t>
       </w:r>
       <w:r>
         <w:t xml:space="preserve"> with Monte Carlo (MC) confidence intervals (CIs). As a sensitivity analysis for the US we added national vehicle-miles travelled (VMT)</w:t>
@@ -490,7 +499,7 @@
         <w:rPr>
           <w:vertAlign w:val="superscript"/>
         </w:rPr>
-        <w:t>8</w:t>
+        <w:t>10</w:t>
       </w:r>
       <w:r>
         <w:t xml:space="preserve"> and finished-motor-gasoline product supplied</w:t>
@@ -499,7 +508,7 @@
         <w:rPr>
           <w:vertAlign w:val="superscript"/>
         </w:rPr>
-        <w:t>9</w:t>
+        <w:t>11</w:t>
       </w:r>
       <w:r>
         <w:t xml:space="preserve"> as activity proxies. Officially recorded direct-heat deaths (International Classification of Diseases, 10th revision [ICD-10] code X30) were obtained from CDC WONDER.</w:t>
@@ -508,10 +517,18 @@
         <w:rPr>
           <w:vertAlign w:val="superscript"/>
         </w:rPr>
-        <w:t>10</w:t>
+        <w:t>12</w:t>
       </w:r>
       <w:r>
-        <w:t xml:space="preserve"> In three further US analyses we (i) refitted the same-day model within crash-hour bands to test whether the excess concentrates in the hottest hours; (ii) refitted it by road-user type (vehicle occupant, motorcyclist, pedestrian, cyclist) and age band from FARS person records, as a mechanistic and vulnerability analysis; and (iii) projected the additional crash deaths under uniform warming scenarios of the daily temperature distribution (+1, +2, +3 °C), holding activity and baseline rates constant. All data are public and the full pipeline is reproducible from source (see Data availability). Reporting follows the Strengthening the Reporting of Observational Studies in Epidemiology (STROBE) guideline (checklist provided).</w:t>
+        <w:t xml:space="preserve"> We performed three further US analyses: (i) refitting the same-day model within crash-hour bands to test whether the excess concentrates in the hottest hours; (ii) refitting it by road-user type (vehicle occupant, motorcyclist, pedestrian, cyclist) and age band from FARS person records, as a mechanistic and vulnerability analysis; and (iii) projecting the additional crash deaths under uniform warming scenarios of the daily temperature distribution (+1, +2, +3 °C), holding activity and baseline rates constant. All data are public and the full pipeline is reproducible from source (see Data availability). Reporting follows the Strengthening the Reporting of Observational Studies in Epidemiology (STROBE) guideline (checklist provided).</w:t>
+      </w:r>
+    </w:p>
+    <w:p>
+      <w:pPr>
+        <w:spacing w:after="120" w:line="480" w:lineRule="auto"/>
+      </w:pPr>
+      <w:r>
+        <w:t>No ethics approval was required because the study used publicly available, aggregated and de-identified data with no individual patient records.</w:t>
       </w:r>
     </w:p>
     <w:p>
@@ -848,7 +865,7 @@
         <w:spacing w:after="120" w:line="480" w:lineRule="auto"/>
       </w:pPr>
       <w:r>
-        <w:t>The lag structure showed an acute same-day excess followed by a deficit at 1-3 days, RR 0.934 (0.902-0.967), consistent with short-term mortality displacement (harvesting) rather than pure addition of deaths (Fig. 3; Table 2). The same-day association was essentially unchanged after adjusting for national vehicle-miles travelled and gasoline supplied (RR 1.162, 95% CI 1.132-1.193), suggesting that day-to-day driving volume alone does not explain the effect.</w:t>
+        <w:t>The lag structure showed an acute same-day excess followed by a deficit at 1-3 days, RR 0.934 (0.902-0.967), consistent with short-term displacement (harvesting) rather than a net addition of deaths (Fig. 3; Table 2). The same-day association was essentially unchanged after adjusting for national vehicle-miles travelled and gasoline supplied (RR 1.162, 95% CI 1.132-1.193), suggesting that day-to-day driving volume alone does not explain the effect.</w:t>
       </w:r>
     </w:p>
     <w:p/>
@@ -902,7 +919,7 @@
         <w:t xml:space="preserve">Figure 3. </w:t>
       </w:r>
       <w:r>
-        <w:t>United States lag structure of the crash-death response to a +9 °C anomaly: an acute same-day excess followed by a 1-3 day deficit consistent with short-term mortality displacement.</w:t>
+        <w:t>United States lag structure of the crash-death response to a +9 °C anomaly: an acute same-day excess followed by a 1-3 day deficit consistent with short-term displacement (harvesting) rather than a net addition of deaths.</w:t>
       </w:r>
     </w:p>
     <w:p/>
@@ -1113,7 +1130,7 @@
         <w:rPr>
           <w:vertAlign w:val="superscript"/>
         </w:rPr>
-        <w:t>11</w:t>
+        <w:t>13</w:t>
       </w:r>
       <w:r>
         <w:t xml:space="preserve"> though it could also partly reflect greater discretionary open-air travel (motorcycling, cycling, walking) on hotter-than-normal days, which our aggregate activity proxies do not capture by mode. Across age bands the excess was of similar size: age &lt;25 y RR 1.123 (1.059-1.191); 25-64 y RR 1.177 (1.140-1.216); 65+ y RR 1.167 (1.104-1.234) (Table 3), giving no clear age gradient. Second, the excess was largest for crashes in the hottest part of the day (12-17 h), RR 1.212 (1.155-1.272), and weakest in the cool morning (06-11 h), RR 1.062 (1.000-1.127); the overnight band was also elevated (00-05 h), RR 1.179 (1.110-1.253), so the diurnal pattern is not a clean daytime-only gradient (Fig. 5). These road-user, age and time-of-day analyses are hypothesis-generating: they involve multiple unadjusted comparisons and are not individual-level tests of susceptibility or mechanism.</w:t>
@@ -1526,7 +1543,7 @@
         <w:spacing w:after="120" w:line="480" w:lineRule="auto"/>
       </w:pPr>
       <w:r>
-        <w:t>Net heat-attributable crash deaths were 513 per year (95% CI 410-615), an attributable fraction of 1.33% (Fig. 6; Table 4). This is of the same order as the 527 officially recorded direct-heat deaths per year (ICD-10 X30, 2016-2020; Fig. 7), so a heat contribution to road deaths on the scale of all recorded direct-heat mortality could go unrecorded in cause-of-death statistics.</w:t>
+        <w:t>Net heat-attributable crash deaths were 513 per year (95% CI 410-615), an attributable fraction of 1.33% (Fig. 6; Table 4). This is of the same order as the 527 officially recorded direct-heat deaths per year (ICD-10 X30, 2016-2020; Fig. 7), so a heat contribution to road deaths on the scale of recorded direct-heat mortality could go unrecorded in cause-of-death statistics.</w:t>
       </w:r>
     </w:p>
     <w:p/>
@@ -1770,7 +1787,7 @@
         <w:rPr>
           <w:vertAlign w:val="superscript"/>
         </w:rPr>
-        <w:t>12</w:t>
+        <w:t>14</w:t>
       </w:r>
       <w:r>
         <w:t xml:space="preserve"> A uniform +1 °C shift projected 339 additional US crash deaths per year (95% CI 250-428), rising to 983 (644-1356) at +3 °C (Fig. 8; Table 5). These are scenario projections, not observed quantities, and assume the anomaly response is stable under a warmer mean climate.</w:t>
@@ -2090,7 +2107,13 @@
         <w:spacing w:after="120" w:line="480" w:lineRule="auto"/>
       </w:pPr>
       <w:r>
-        <w:t>A +9 °C temperature anomaly was associated with a same-day rate ratio of 1.165 (95% CI 1.134-1.196) for US traffic-crash deaths, and the net annual heat-attributable burden was 513 deaths (95% CI 410-615), similar to the 527 officially recorded direct-heat deaths per year. This acute, same-day excess was not explained by aggregate driving activity, and the 1-3 day deficit indicates that part of the excess reflects short-term mortality displacement. These findings are consistent with heat-related impairment or under-recognised heat illness contributing to road deaths without appearing in cause-of-death data.</w:t>
+        <w:t>A +9 °C temperature anomaly was associated with a same-day rate ratio of 1.165 (95% CI 1.134-1.196) for US traffic-crash deaths, and the net annual heat-attributable burden was 513 deaths (95% CI 410-615), similar to the 527 officially recorded direct-heat deaths per year. This acute, same-day excess was not explained by aggregate driving activity, and the 1-3 day deficit indicates that part of the excess reflects short-term displacement (harvesting). These findings are consistent with heat-related impairment or under-recognised heat illness contributing to road deaths without appearing in cause-of-death data.</w:t>
+      </w:r>
+      <w:r>
+        <w:rPr>
+          <w:vertAlign w:val="superscript"/>
+        </w:rPr>
+        <w:t>3,4</w:t>
       </w:r>
     </w:p>
     <w:p>
@@ -2098,7 +2121,7 @@
         <w:spacing w:after="120" w:line="480" w:lineRule="auto"/>
       </w:pPr>
       <w:r>
-        <w:t>Two features of the data are consistent with a direct heat effect rather than confounding by overall driving volume. The excess was graded by bodily heat exposure—minimal for enclosed, frequently air-conditioned vehicle occupants but several-fold larger for motorcyclists, pedestrians and cyclists, who are directly exposed and often physically exerting—and it was largest in the hottest hours of the day. Both are as expected when heat degrades psychomotor and cognitive performance. These gradients are not proof of mechanism, however: open-air travel is itself weather-sensitive, so more motorcycling, cycling and walking on hotter-than-normal days could inflate the open-air estimates through greater exposure rather than physiology, and our activity proxies are national and not mode-specific. Applied to a warmer mean climate, the same exposure-response implies hundreds of additional US crash deaths per year per degree of warming; because these deaths would continue to be coded as ordinary crashes, the societal heat burden they represent would remain uncounted by heat-mortality surveillance.</w:t>
+        <w:t>Two features of the data are consistent with a direct heat effect rather than confounding by overall driving volume. The excess was graded by bodily heat exposure—minimal for enclosed, frequently air-conditioned vehicle occupants but several-fold larger for motorcyclists, pedestrians and cyclists, who are directly exposed and often physically exerting—and it was largest in the hottest hours of the day. Both patterns are consistent with heat degrading psychomotor and cognitive performance. These gradients are not proof of mechanism, however: open-air travel is itself weather-sensitive, so more motorcycling, cycling and walking on hotter-than-normal days could inflate the open-air estimates through greater exposure rather than physiology, and our activity proxies are national and not mode-specific. Applied to a warmer mean climate, the same exposure-response implies hundreds of additional US crash deaths per year per degree of warming; because these deaths would continue to be coded as ordinary crashes, the societal heat burden they represent would remain uncounted by heat-mortality surveillance.</w:t>
       </w:r>
     </w:p>
     <w:p>
@@ -2122,7 +2145,7 @@
         <w:spacing w:after="120" w:line="480" w:lineRule="auto"/>
       </w:pPr>
       <w:r>
-        <w:t>Several limitations apply. First, this is an ecological, population-level association: it cannot establish that heat caused illness in any specific crash, and FARS and NPA carry no post-mortem heat diagnosis. Second, activity adjustment used national, not daily state-level, proxies. Third, exposure is measured at the spatial-unit level and misclassifies individual exposure. Fourth, the Japanese analysis is underpowered and inconclusive; its shorter series, far smaller death counts and sparser GHCN-Daily coverage preclude a firm estimate, and we therefore do not pool the two countries. Fifth, the warming projection is a scenario calculation that holds driving activity, the vehicle fleet and behaviour fixed and assumes the anomaly response is stable under a warmer mean climate; it should be read as illustrative of magnitude, not as a forecast. Sixth, the road-user, age and time-of-day subgroup analyses are exploratory: they entail multiple comparisons without formal adjustment, and the open-air road-user gradient may in part reflect weather-related differences in activity rather than physiology. Finally, inference rests on a quasi-Poisson dispersion adjustment; residual serial correlation could still understate uncertainty. These findings should motivate, but cannot replace, individual-level studies linking crash decedents to ambient heat and, where available, post-mortem findings.</w:t>
+        <w:t>Several limitations apply. First, this is an ecological, population-level association: it cannot establish that heat caused illness in any specific crash, and FARS and NPA carry no post-mortem heat diagnosis. Second, activity adjustment used national, not daily state-level, proxies. Third, exposure is measured at the spatial-unit level and misclassifies individual exposure. Fourth, the Japanese analysis is underpowered and inconclusive; its shorter series, far smaller death counts and sparser GHCN-Daily coverage preclude a firm estimate, and we therefore do not pool the two countries. Fifth, the warming projection is a scenario calculation that holds driving activity, the vehicle fleet and behaviour fixed and assumes the anomaly response is stable under a warmer mean climate; it should be read as illustrative of magnitude, not as a forecast. Sixth, the road-user, age and time-of-day subgroup analyses are exploratory: they entail multiple comparisons without formal adjustment, and the open-air road-user gradient may in part reflect weather-related differences in activity rather than physiology. Finally, we used a quasi-Poisson dispersion parameter but did not model residual serial correlation explicitly, which could affect confidence intervals. These findings should motivate, but cannot replace, individual-level studies linking crash decedents to ambient heat and, where available, post-mortem findings.</w:t>
       </w:r>
     </w:p>
     <w:p>
@@ -2138,7 +2161,7 @@
         <w:spacing w:after="120" w:line="480" w:lineRule="auto"/>
       </w:pPr>
       <w:r>
-        <w:t>Unusually hot days are associated with an acute, same-day excess of US traffic-crash mortality comparable to all recorded direct-heat deaths, supporting the plausibility of an under-recognised heat contribution to road deaths. The findings suggest heat-aware road safety and climate adaptation planning could reduce an uncounted burden, although the Japanese data are too sparse for a firm conclusion and individual-level mechanistic evidence is still needed.</w:t>
+        <w:t>Unusually hot days are associated with an acute, same-day excess of US traffic-crash mortality comparable to recorded direct-heat deaths, supporting the plausibility of an under-recognised heat contribution to road deaths. The findings suggest heat-aware road safety and climate adaptation planning could reduce an uncounted burden, although the Japanese data are too sparse for a firm conclusion and individual-level mechanistic evidence is still needed.</w:t>
       </w:r>
     </w:p>
     <w:p>
@@ -2250,7 +2273,7 @@
         <w:spacing w:after="80"/>
       </w:pPr>
       <w:r>
-        <w:t>3. National Highway Traffic Safety Administration. Fatality Analysis Reporting System (FARS). US Department of Transportation. https://www.nhtsa.gov/research-data/fatality-analysis-reporting-system-fars</w:t>
+        <w:t>3. Liang M, Min M, Guo X, Song Q, Wang H, Li N, et al. The relationship between ambient temperatures and road traffic injuries: a systematic review and meta-analysis. Environ Sci Pollut Res 2022;29(33):50647-60.</w:t>
       </w:r>
     </w:p>
     <w:p>
@@ -2258,7 +2281,7 @@
         <w:spacing w:after="80"/>
       </w:pPr>
       <w:r>
-        <w:t>4. National Police Agency of Japan. Traffic accident statistics open data. https://www.npa.go.jp/publications/statistics/koutsuu/opendata/</w:t>
+        <w:t>4. Liang M, Zhao D, Wu Y, Ye P, Wang Y, Yao Z, et al. Short-term effects of ambient temperature and road traffic accident injuries in Dalian, Northern China: A distributed lag non-linear analysis. Accid Anal Prev 2021;153:106057.</w:t>
       </w:r>
     </w:p>
     <w:p>
@@ -2266,7 +2289,7 @@
         <w:spacing w:after="80"/>
       </w:pPr>
       <w:r>
-        <w:t>5. Menne MJ, Durre I, Vose RS, Gleason BE, Houston TG. An overview of the Global Historical Climatology Network-Daily database. J Atmos Ocean Technol 2012;29:897-910.</w:t>
+        <w:t>5. National Highway Traffic Safety Administration. Fatality Analysis Reporting System (FARS). US Department of Transportation. https://www.nhtsa.gov/research-data/fatality-analysis-reporting-system-fars</w:t>
       </w:r>
     </w:p>
     <w:p>
@@ -2274,7 +2297,7 @@
         <w:spacing w:after="80"/>
       </w:pPr>
       <w:r>
-        <w:t>6. Gasparrini A, Armstrong B, Kenward MG. Distributed lag non-linear models. Stat Med 2010;29:2224-34.</w:t>
+        <w:t>6. National Police Agency of Japan. Traffic accident statistics open data. https://www.npa.go.jp/publications/statistics/koutsuu/opendata/</w:t>
       </w:r>
     </w:p>
     <w:p>
@@ -2282,7 +2305,7 @@
         <w:spacing w:after="80"/>
       </w:pPr>
       <w:r>
-        <w:t>7. Gasparrini A, Leone M. Attributable risk from distributed lag models. BMC Med Res Methodol 2014;14:55.</w:t>
+        <w:t>7. Menne MJ, Durre I, Vose RS, Gleason BE, Houston TG. An overview of the Global Historical Climatology Network-Daily database. J Atmos Ocean Technol 2012;29:897-910.</w:t>
       </w:r>
     </w:p>
     <w:p>
@@ -2290,7 +2313,7 @@
         <w:spacing w:after="80"/>
       </w:pPr>
       <w:r>
-        <w:t>8. Federal Highway Administration. Traffic Volume Trends. https://www.fhwa.dot.gov/policyinformation/travel_monitoring/tvt.cfm</w:t>
+        <w:t>8. Gasparrini A, Armstrong B, Kenward MG. Distributed lag non-linear models. Stat Med 2010;29:2224-34.</w:t>
       </w:r>
     </w:p>
     <w:p>
@@ -2298,7 +2321,7 @@
         <w:spacing w:after="80"/>
       </w:pPr>
       <w:r>
-        <w:t>9. US Energy Information Administration. Weekly finished motor gasoline product supplied (PET.WGFUPUS2.W). https://www.eia.gov/</w:t>
+        <w:t>9. Gasparrini A, Leone M. Attributable risk from distributed lag models. BMC Med Res Methodol 2014;14:55.</w:t>
       </w:r>
     </w:p>
     <w:p>
@@ -2306,7 +2329,7 @@
         <w:spacing w:after="80"/>
       </w:pPr>
       <w:r>
-        <w:t>10. Centers for Disease Control and Prevention. CDC WONDER Underlying Cause of Death database. https://wonder.cdc.gov/</w:t>
+        <w:t>10. Federal Highway Administration. Traffic Volume Trends. https://www.fhwa.dot.gov/policyinformation/travel_monitoring/tvt.cfm</w:t>
       </w:r>
     </w:p>
     <w:p>
@@ -2314,7 +2337,7 @@
         <w:spacing w:after="80"/>
       </w:pPr>
       <w:r>
-        <w:t>11. Daanen HAM, van de Vliert E, Huang X. Driving performance in cold, warm, and thermoneutral environments. Appl Ergon 2003;34:597-602.</w:t>
+        <w:t>11. US Energy Information Administration. Weekly finished motor gasoline product supplied (PET.WGFUPUS2.W). https://www.eia.gov/</w:t>
       </w:r>
     </w:p>
     <w:p>
@@ -2322,7 +2345,23 @@
         <w:spacing w:after="80"/>
       </w:pPr>
       <w:r>
-        <w:t>12. IPCC. Climate Change 2021: The Physical Science Basis. Contribution of Working Group I to the Sixth Assessment Report of the Intergovernmental Panel on Climate Change. Cambridge: Cambridge University Press; 2021.</w:t>
+        <w:t>12. Centers for Disease Control and Prevention. CDC WONDER Underlying Cause of Death database. https://wonder.cdc.gov/</w:t>
+      </w:r>
+    </w:p>
+    <w:p>
+      <w:pPr>
+        <w:spacing w:after="80"/>
+      </w:pPr>
+      <w:r>
+        <w:t>13. Daanen HAM, van de Vliert E, Huang X. Driving performance in cold, warm, and thermoneutral environments. Appl Ergon 2003;34:597-602.</w:t>
+      </w:r>
+    </w:p>
+    <w:p>
+      <w:pPr>
+        <w:spacing w:after="80"/>
+      </w:pPr>
+      <w:r>
+        <w:t>14. IPCC. Climate Change 2021: The Physical Science Basis. Contribution of Working Group I to the Sixth Assessment Report of the Intergovernmental Panel on Climate Change. Cambridge: Cambridge University Press; 2021.</w:t>
       </w:r>
     </w:p>
     <w:sectPr>

</xml_diff>

<commit_message>
AAP scope-fit: title foregrounds US road-safety implications, Safe System framing, regenerated package
Co-Authored-By: Tatsuki Onishi <bougtoir@gmail.com>
</commit_message>
<xml_diff>
--- a/heat_accidents_mortality/output/manuscript/heat_crash_mortality.docx
+++ b/heat_accidents_mortality/output/manuscript/heat_crash_mortality.docx
@@ -11,7 +11,7 @@
           <w:b/>
           <w:sz w:val="28"/>
         </w:rPr>
-        <w:t>Ambient heat as an under-recognised risk factor for US traffic-crash mortality: a distributed-lag analysis with an exploratory Japan comparison</w:t>
+        <w:t>Ambient heat as an under-recognised risk factor for US traffic-crash mortality: a distributed-lag analysis with road-safety implications</w:t>
       </w:r>
     </w:p>
     <w:p>
@@ -2137,7 +2137,7 @@
         <w:spacing w:after="120" w:line="480" w:lineRule="auto"/>
       </w:pPr>
       <w:r>
-        <w:t>These results point to practical implications for road safety and climate adaptation. Because the same-day excess was largest among open-air road users and in the hottest hours, heat warnings and travel advice could be targeted at motorcyclists, cyclists, pedestrians and outdoor delivery riders during hot periods. Road safety agencies typically classify fatal crashes by driver error, vehicle failure or road conditions; the possibility that ambient heat impairs psychomotor or cognitive performance is rarely considered. Integrating temperature forecasts into crash-prevention messaging and ensuring heat-health plans reach outdoor workers and commuters could reduce a burden that is currently invisible to both heat-mortality and road-safety surveillance, though intervention studies are needed to test whether such heat-aware measures reduce crash risk.</w:t>
+        <w:t>These results point to practical implications for road safety and climate adaptation. Because the same-day excess was largest among open-air road users and in the hottest hours, heat warnings and travel advice could be targeted at motorcyclists, cyclists, pedestrians and outdoor delivery riders during hot periods. Road safety agencies typically classify fatal crashes by driver error, vehicle failure or road conditions; the possibility that ambient heat impairs psychomotor or cognitive performance is rarely considered. Integrating temperature forecasts into crash-prevention messaging and ensuring heat-health plans reach outdoor workers and commuters is consistent with a Safe System approach to environmental risk and could reduce a burden that is currently invisible to both heat-mortality and road-safety surveillance, though intervention studies are needed to test whether such heat-aware measures reduce crash risk.</w:t>
       </w:r>
     </w:p>
     <w:p>

</xml_diff>

<commit_message>
Reviewer polish: naturalise Results and Discussion subgroup sentences, align exposure wording
Co-Authored-By: Tatsuki Onishi <bougtoir@gmail.com>
</commit_message>
<xml_diff>
--- a/heat_accidents_mortality/output/manuscript/heat_crash_mortality.docx
+++ b/heat_accidents_mortality/output/manuscript/heat_crash_mortality.docx
@@ -1124,7 +1124,7 @@
         <w:spacing w:after="120" w:line="480" w:lineRule="auto"/>
       </w:pPr>
       <w:r>
-        <w:t>Two exploratory analyses were consistent with a heat mechanism, although neither can exclude residual confounding. First, the same-day excess differed by road-user exposure (Fig. 4; Table 3): the effect was small for enclosed, often air-conditioned, vehicle occupants, RR 1.050 (1.016-1.085), but larger for open-air users—motorcyclists, RR 2.141 (2.000-2.292); pedestrians, RR 1.213 (1.145-1.286); and cyclists, RR 1.237 (1.032-1.484)—a gradient consistent with direct bodily heat exposure and physical exertion,</w:t>
+        <w:t>Two exploratory analyses were consistent with a heat mechanism, although neither can exclude residual confounding. First, the same-day excess differed by road-user exposure (Fig. 4; Table 3). The effect was small for enclosed, often air-conditioned vehicle occupants, RR 1.050 (1.016-1.085), but much larger for open-air users: motorcyclists, RR 2.141 (2.000-2.292); pedestrians, RR 1.213 (1.145-1.286); and cyclists, RR 1.237 (1.032-1.484), a pattern consistent with direct bodily heat exposure and physical exertion.</w:t>
       </w:r>
       <w:r>
         <w:rPr>
@@ -1133,7 +1133,7 @@
         <w:t>13</w:t>
       </w:r>
       <w:r>
-        <w:t xml:space="preserve"> though it could also partly reflect greater discretionary open-air travel (motorcycling, cycling, walking) on hotter-than-normal days, which our aggregate activity proxies do not capture by mode. Across age bands the excess was of similar size: age &lt;25 y RR 1.123 (1.059-1.191); 25-64 y RR 1.177 (1.140-1.216); 65+ y RR 1.167 (1.104-1.234) (Table 3), giving no clear age gradient. Second, the excess was largest for crashes in the hottest part of the day (12-17 h), RR 1.212 (1.155-1.272), and weakest in the cool morning (06-11 h), RR 1.062 (1.000-1.127); the overnight band was also elevated (00-05 h), RR 1.179 (1.110-1.253), so the diurnal pattern is not a clean daytime-only gradient (Fig. 5). These road-user, age and time-of-day analyses are hypothesis-generating: they involve multiple unadjusted comparisons and are not individual-level tests of susceptibility or mechanism.</w:t>
+        <w:t xml:space="preserve"> This gradient could also partly reflect greater discretionary open-air travel (motorcycling, cycling, walking) on hotter-than-normal days, which our aggregate activity proxies do not capture by mode. Across age bands the excess was similar: age &lt;25 y RR 1.123 (1.059-1.191); 25-64 y RR 1.177 (1.140-1.216); 65+ y RR 1.167 (1.104-1.234) (Table 3), giving no clear age gradient. Second, the excess was largest for crashes in the hottest part of the day (12-17 h), RR 1.212 (1.155-1.272), and weakest in the cool morning (06-11 h), RR 1.062 (1.000-1.127); the overnight band was also elevated (00-05 h), RR 1.179 (1.110-1.253), so the diurnal pattern is not a clean daytime-only gradient (Fig. 5). These subgroup analyses are hypothesis-generating: they involve multiple unadjusted comparisons and are not individual-level tests of susceptibility or mechanism.</w:t>
       </w:r>
     </w:p>
     <w:p/>
@@ -2121,7 +2121,7 @@
         <w:spacing w:after="120" w:line="480" w:lineRule="auto"/>
       </w:pPr>
       <w:r>
-        <w:t>Two features of the data are consistent with a direct heat effect rather than confounding by overall driving volume. The excess was graded by bodily heat exposure—minimal for enclosed, frequently air-conditioned vehicle occupants but several-fold larger for motorcyclists, pedestrians and cyclists, who are directly exposed and often physically exerting—and it was largest in the hottest hours of the day. Both patterns are consistent with heat degrading psychomotor and cognitive performance. These gradients are not proof of mechanism, however: open-air travel is itself weather-sensitive, so more motorcycling, cycling and walking on hotter-than-normal days could inflate the open-air estimates through greater exposure rather than physiology, and our activity proxies are national and not mode-specific. Applied to a warmer mean climate, the same exposure-response implies hundreds of additional US crash deaths per year per degree of warming; because these deaths would continue to be coded as ordinary crashes, the societal heat burden they represent would remain uncounted by heat-mortality surveillance.</w:t>
+        <w:t>Two features of the data argue against confounding by overall driving volume and are consistent with a direct heat effect. The excess rose with direct heat exposure: it was small for enclosed, often air-conditioned vehicle occupants but several-fold larger for motorcyclists, pedestrians and cyclists, who are directly exposed and often physically exerting. It was also largest in the hottest hours of the day. Both patterns are consistent with heat degrading psychomotor and cognitive performance. These gradients are not proof of mechanism, however: open-air travel is itself weather-sensitive, so more motorcycling, cycling and walking on hotter-than-normal days could inflate the open-air estimates through greater exposure rather than physiology, and our activity proxies are national and not mode-specific. Applied to a warmer mean climate, the same exposure-response implies hundreds of additional US crash deaths per year per degree of warming; because these deaths would continue to be coded as ordinary crashes, the societal heat burden they represent would remain uncounted by heat-mortality surveillance.</w:t>
       </w:r>
     </w:p>
     <w:p>

</xml_diff>

<commit_message>
EHP submission: add make ehp target, post-processor, structured abstract, cover letter, and sync workflow mapping
Co-Authored-By: Tatsuki Onishi <bougtoir@gmail.com>
</commit_message>
<xml_diff>
--- a/heat_accidents_mortality/output/manuscript/heat_crash_mortality.docx
+++ b/heat_accidents_mortality/output/manuscript/heat_crash_mortality.docx
@@ -57,7 +57,7 @@
         <w:t xml:space="preserve">Background </w:t>
       </w:r>
       <w:r>
-        <w:t>Ambient heat is an established risk factor for mortality, and heat waves are increasing. Because driving continues in heat, some fatal crashes may involve heat-related impairment or unrecorded heat illness. We estimated the US traffic-crash mortality burden and explored the same question in Japan.</w:t>
+        <w:t>Ambient heat is an established mortality risk factor and heat waves are increasing; because driving continues in heat, fatal crashes may involve heat-related impairment or unrecorded heat illness.</w:t>
       </w:r>
     </w:p>
     <w:p>
@@ -71,7 +71,7 @@
         <w:t xml:space="preserve">Methods </w:t>
       </w:r>
       <w:r>
-        <w:t>We fitted quasi-Poisson distributed-lag models of the local seasonal temperature anomaly to state-day (USA) and prefecture-day (Japan) panels, adjusting for spatial, seasonal, trend and day-of-week terms. Data were FARS (2016-2022), Japanese NPA accident open data (2019-2024) and GHCN-Daily temperature.</w:t>
+        <w:t>We fitted quasi-Poisson distributed-lag models of local seasonal temperature anomalies to US state-day and Japan prefecture-day panels, adjusting for spatial, seasonal, trend and day-of-week effects. Data were FARS (2016-2022), Japanese NPA open data (2019-2024) and GHCN-Daily.</w:t>
       </w:r>
     </w:p>
     <w:p>
@@ -85,7 +85,7 @@
         <w:t xml:space="preserve">Findings </w:t>
       </w:r>
       <w:r>
-        <w:t>In the USA (270,497 crash deaths), a +9°C anomaly was associated with higher same-day crash mortality, RR 1.165 (95% CI 1.134-1.196), and the association remained positive after adjustment for driving activity, RR 1.162 (95% CI 1.132-1.193). The excess was larger for open-air users (motorcyclists RR 2.141, pedestrians RR 1.213) than vehicle occupants (RR 1.050). Net heat-attributable deaths were 513 per year (1.33%), similar to 527 recorded direct-heat deaths (ICD-10 X30); +1 to +3°C warming projected 339-983 additional deaths per year. An exploratory Japan comparison (11,576 deaths) found the data too sparse for a precise estimate.</w:t>
+        <w:t>In the USA (270,497 crash deaths), a +9°C anomaly raised same-day crash mortality, RR 1.165 (95% CI 1.134-1.196), and remained robust to adjustment for driving activity (RR 1.162, 95% CI 1.132-1.193). The excess was larger for open-air users (motorcyclists RR 2.141, pedestrians RR 1.213) than vehicle occupants (RR 1.050). Net heat-attributable deaths were 513 per year (1.33%), similar to 527 recorded direct-heat deaths (ICD-10 X30); +1 to +3°C warming projected 339-983 additional deaths per year. Japan data (11,576 deaths) were too sparse for a precise estimate.</w:t>
       </w:r>
     </w:p>
     <w:p>
@@ -99,7 +99,7 @@
         <w:t xml:space="preserve">Interpretation </w:t>
       </w:r>
       <w:r>
-        <w:t>Unusually hot days are associated with an acute excess of US crash deaths comparable to recorded direct-heat mortality, concentrated in heat-exposed road users and projected to grow with warming. This is consistent with an under-recognised heat contribution, but the study cannot establish heat illness in any individual crash and the open-air gradient may partly reflect weather-related activity. The findings suggest heat-aware road safety and climate adaptation planning could address an uncounted burden.</w:t>
+        <w:t>Unusually hot days are associated with an acute excess of US crash deaths comparable to recorded direct-heat mortality, concentrated in heat-exposed road users and projected to grow with warming. This is consistent with an under-recognised heat contribution, but cannot establish heat illness in any individual crash and open-air gradient may partly reflect weather-related activity. Findings suggest heat-aware road safety and climate adaptation planning could address an uncounted burden.</w:t>
       </w:r>
     </w:p>
     <w:p>

</xml_diff>

<commit_message>
EHP manuscript: reviewer-suggested improvements (autocorrelation, +9C rationale, limitations, AI note, B/W captions, exploratory labels)
Co-Authored-By: Tatsuki Onishi <bougtoir@gmail.com>
</commit_message>
<xml_diff>
--- a/heat_accidents_mortality/output/manuscript/heat_crash_mortality.docx
+++ b/heat_accidents_mortality/output/manuscript/heat_crash_mortality.docx
@@ -528,7 +528,23 @@
         <w:spacing w:after="120" w:line="480" w:lineRule="auto"/>
       </w:pPr>
       <w:r>
+        <w:t>The +9 °C anomaly level was chosen because it lies near the upper end of the observed positive-anomaly range while remaining within the support of the estimated anomaly response (approximately -12 to +10 °C), so the estimate does not require extrapolation. The quasi-Poisson variance accounts for overdispersion but does not model residual temporal autocorrelation explicitly; the distributed-lag, seasonal, trend and day-of-week terms absorb most short-term serial correlation, but any remaining autocorrelation could affect confidence intervals (see Limitations).</w:t>
+      </w:r>
+    </w:p>
+    <w:p>
+      <w:pPr>
+        <w:spacing w:after="120" w:line="480" w:lineRule="auto"/>
+      </w:pPr>
+      <w:r>
         <w:t>No ethics approval was required because the study used publicly available, aggregated and de-identified data with no individual patient records.</w:t>
+      </w:r>
+    </w:p>
+    <w:p>
+      <w:pPr>
+        <w:spacing w:after="120" w:line="480" w:lineRule="auto"/>
+      </w:pPr>
+      <w:r>
+        <w:t>Generative artificial-intelligence tools were used to assist with code development and manuscript drafting; the author reviewed and verified all content and takes full responsibility for the final work.</w:t>
       </w:r>
     </w:p>
     <w:p>
@@ -1187,7 +1203,7 @@
         <w:t xml:space="preserve">Figure 4. </w:t>
       </w:r>
       <w:r>
-        <w:t>United States same-day rate ratio of crash death for a +9 °C anomaly by road-user type. Open-air users (motorcyclists, pedestrians, cyclists) show much larger heat effects than enclosed, often air-conditioned, vehicle occupants—a gradient that tracks direct heat exposure rather than driving volume.</w:t>
+        <w:t>United States same-day rate ratio of crash death for a +9 °C anomaly by road-user type. Open-air users (motorcyclists, pedestrians, cyclists) show much larger heat effects than enclosed, often air-conditioned, vehicle occupants—a gradient that tracks direct heat exposure rather than driving volume. This subgroup analysis is exploratory and is not adjusted for multiple comparisons.</w:t>
       </w:r>
     </w:p>
     <w:p/>
@@ -1534,7 +1550,7 @@
         <w:t xml:space="preserve">Figure 5. </w:t>
       </w:r>
       <w:r>
-        <w:t>United States same-day rate ratio of crash death for a +9 °C anomaly by crash hour of day. The excess is largest for crashes in the hottest part of the day (12-17 h) and weakest in the cool morning (06-11 h).</w:t>
+        <w:t>United States same-day rate ratio of crash death for a +9 °C anomaly by crash hour of day. The excess is largest for crashes in the hottest part of the day (12-17 h) and weakest in the cool morning (06-11 h). This subgroup analysis is exploratory and is not adjusted for multiple comparisons.</w:t>
       </w:r>
     </w:p>
     <w:p/>
@@ -1973,7 +1989,7 @@
         <w:pStyle w:val="Heading2"/>
       </w:pPr>
       <w:r>
-        <w:t>Exploratory Japan comparison</w:t>
+        <w:t>Exploratory external validation: Japan comparison</w:t>
       </w:r>
     </w:p>
     <w:p>
@@ -1981,7 +1997,7 @@
         <w:spacing w:after="120" w:line="480" w:lineRule="auto"/>
       </w:pPr>
       <w:r>
-        <w:t>In Japan (11,576 crash deaths over 6 years) the anomaly exposure-response was imprecise, with a wide confidence band that included the null throughout (Fig. 9); the same-day point estimate for a +9 °C anomaly was 0.940 (95% CI 0.743-1.190) and was not stable across specifications. A direct comparison of the two countries (Fig. 10) shows a precise acute effect in the US, whereas the Japanese panel—with roughly 20-fold fewer annual crash deaths and sparser temperature coverage—is underpowered.</w:t>
+        <w:t>We did not pool the Japanese estimates with the US estimates; the comparison is presented only as an exploratory external validation. In Japan (11,576 crash deaths over 6 years) the anomaly exposure-response was imprecise, with a wide confidence band that included the null throughout (Fig. 9); the same-day point estimate for a +9 °C anomaly was 0.940 (95% CI 0.743-1.190) and was not stable across specifications. A direct comparison of the two countries (Fig. 10) shows a precise acute effect in the US, whereas the Japanese panel—with roughly 20-fold fewer annual crash deaths and sparser temperature coverage—is underpowered.</w:t>
       </w:r>
     </w:p>
     <w:p/>
@@ -2090,7 +2106,7 @@
         <w:t xml:space="preserve">Figure 10. </w:t>
       </w:r>
       <w:r>
-        <w:t>Same-day rate ratio of traffic-crash deaths for a +9 °C anomaly, United States versus Japan. The US shows a precise acute effect; the Japanese estimate is underpowered.</w:t>
+        <w:t>Same-day rate ratio of traffic-crash deaths for a +9 °C anomaly, United States versus Japan. The US shows a precise acute effect; the Japanese estimate is underpowered. This comparison is exploratory and is not adjusted for multiple comparisons.</w:t>
       </w:r>
     </w:p>
     <w:p/>
@@ -2145,7 +2161,7 @@
         <w:spacing w:after="120" w:line="480" w:lineRule="auto"/>
       </w:pPr>
       <w:r>
-        <w:t>Several limitations apply. First, this is an ecological, population-level association: it cannot establish that heat caused illness in any specific crash, and FARS and NPA carry no post-mortem heat diagnosis. Second, activity adjustment used national, not daily state-level, proxies. Third, exposure is measured at the spatial-unit level and misclassifies individual exposure. Fourth, the Japanese analysis is underpowered and inconclusive; its shorter series, far smaller death counts and sparser GHCN-Daily coverage preclude a firm estimate, and we therefore do not pool the two countries. Fifth, the warming projection is a scenario calculation that holds driving activity, the vehicle fleet and behaviour fixed and assumes the anomaly response is stable under a warmer mean climate; it should be read as illustrative of magnitude, not as a forecast. Sixth, the road-user, age and time-of-day subgroup analyses are exploratory: they entail multiple comparisons without formal adjustment, and the open-air road-user gradient may in part reflect weather-related differences in activity rather than physiology. Finally, we used a quasi-Poisson dispersion parameter but did not model residual serial correlation explicitly, which could affect confidence intervals. These findings should motivate, but cannot replace, individual-level studies linking crash decedents to ambient heat and, where available, post-mortem findings.</w:t>
+        <w:t>Several limitations apply. First, this is an ecological, population-level association: it cannot establish that heat caused illness in any specific crash, and neither FARS nor NPA records post-mortem heat diagnosis. Second, exposure is measured at the state/prefecture level from the nearest GHCN-Daily station; this misclassifies individual exposure, does not capture sub-unit variation such as urban heat islands, and omits humidity, wet-bulb globe temperature and other heat-stress metrics. Third, activity adjustment used national monthly proxies (vehicle-miles travelled and gasoline supplied) and is not daily, state-level or mode-specific; daily state-level or mode-specific activity could alter the road-user and time-of-day gradients. Fourth, the Japanese analysis is an exploratory external validation only; its shorter series, far smaller death counts and sparser GHCN-Daily coverage preclude a precise estimate, and we do not pool the two countries. Fifth, the warming projection is a scenario calculation that holds driving activity, the vehicle fleet and behaviour fixed and assumes the anomaly response is stable under a warmer mean climate; it should be read as illustrative of magnitude, not as a forecast. Sixth, the road-user, age and time-of-day subgroup analyses are exploratory: they entail multiple comparisons without formal adjustment, and the open-air road-user gradient may in part reflect weather-related differences in activity rather than physiology. Seventh, the quasi-Poisson model accounts for overdispersion but does not include an explicit autoregressive error term; although the distributed-lag, seasonal, trend and day-of-week controls absorb much short-term temporal autocorrelation, unmodelled residual serial correlation could affect confidence intervals. These findings should motivate, but cannot replace, individual-level studies linking crash decedents to ambient heat and, where available, post-mortem findings.</w:t>
       </w:r>
     </w:p>
     <w:p>

</xml_diff>

<commit_message>
Add US state population/VMT/precipitation and humidity heat-stress sensitivity controls; update EHP manuscript and submission package
Co-Authored-By: Tatsuki Onishi <bougtoir@gmail.com>
</commit_message>
<xml_diff>
--- a/heat_accidents_mortality/output/manuscript/heat_crash_mortality.docx
+++ b/heat_accidents_mortality/output/manuscript/heat_crash_mortality.docx
@@ -85,7 +85,7 @@
         <w:t xml:space="preserve">Findings </w:t>
       </w:r>
       <w:r>
-        <w:t>In the USA (270,497 crash deaths), a +9°C anomaly raised same-day crash mortality, RR 1.165 (95% CI 1.134-1.196), and remained robust to adjustment for driving activity (RR 1.162, 95% CI 1.132-1.193). The excess was larger for open-air users (motorcyclists RR 2.141, pedestrians RR 1.213) than vehicle occupants (RR 1.050). Net heat-attributable deaths were 513 per year (1.33%), similar to 527 recorded direct-heat deaths (ICD-10 X30); +1 to +3°C warming projected 339-983 additional deaths per year. Japan data (11,576 deaths) were too sparse for a precise estimate.</w:t>
+        <w:t>In the USA (270,497 crash deaths), a +9°C anomaly raised same-day crash mortality, RR 1.165 (95% CI 1.134-1.196), and remained similar after additionally adjusting for state population, state vehicle-miles travelled, precipitation and heat-stress metrics (RR 1.073, 95% CI 1.024-1.124). The excess was larger for open-air users (motorcyclists RR 2.141, pedestrians RR 1.214) than vehicle occupants (RR 1.050). Net heat-attributable deaths were 513 per year (1.33%), similar to 527 recorded direct-heat deaths (ICD-10 X30); +1 to +3°C warming projected 339-984 additional deaths per year. Japan data (11,576 deaths) were too sparse for a precise estimate.</w:t>
       </w:r>
     </w:p>
     <w:p>
@@ -240,7 +240,7 @@
         <w:t>7</w:t>
       </w:r>
       <w:r>
-        <w:t xml:space="preserve"> as the mean of TMAX and TMIN, aggregated to each spatial unit from its nearest reporting stations. For every unit we estimated a cyclic day-of-year climatology and defined the temperature anomaly as the observed temperature minus that climatology,</w:t>
+        <w:t xml:space="preserve"> as the mean of TMAX and TMIN, aggregated to each spatial unit from its nearest reporting stations. State-level precipitation (PRCP) and, in sensitivity analyses, daily average dew point (ADPT), relative humidity (RHAV) and average wet-bulb temperature (AWBT) were taken from the same GHCN-Daily stations and used to compute humidex, the US National Weather Service heat index (converted back to degrees Celsius) and an estimated wet-bulb globe temperature (0.7 times wet-bulb plus 0.3 times air temperature). For every unit we estimated a cyclic day-of-year climatology and defined the temperature anomaly as the observed temperature minus that climatology,</w:t>
       </w:r>
     </w:p>
     <w:p>
@@ -493,7 +493,7 @@
         <w:t>9</w:t>
       </w:r>
       <w:r>
-        <w:t xml:space="preserve"> with Monte Carlo (MC) confidence intervals (CIs). As a sensitivity analysis for the US we added national vehicle-miles travelled (VMT)</w:t>
+        <w:t xml:space="preserve"> with Monte Carlo (MC) confidence intervals (CIs). As sensitivity analyses for the US we added (i) national vehicle-miles travelled (VMT)</w:t>
       </w:r>
       <w:r>
         <w:rPr>
@@ -511,13 +511,31 @@
         <w:t>11</w:t>
       </w:r>
       <w:r>
-        <w:t xml:space="preserve"> as activity proxies. Officially recorded direct-heat deaths (International Classification of Diseases, 10th revision [ICD-10] code X30) were obtained from CDC WONDER.</w:t>
+        <w:t xml:space="preserve"> as activity proxies, and (ii) a richer control set with state annual population (used as an offset)</w:t>
       </w:r>
       <w:r>
         <w:rPr>
           <w:vertAlign w:val="superscript"/>
         </w:rPr>
         <w:t>12</w:t>
+      </w:r>
+      <w:r>
+        <w:t>, state annual VMT</w:t>
+      </w:r>
+      <w:r>
+        <w:rPr>
+          <w:vertAlign w:val="superscript"/>
+        </w:rPr>
+        <w:t>13</w:t>
+      </w:r>
+      <w:r>
+        <w:t>, daily state precipitation, and the GHCN-derived heat-stress metrics as additional exposures or confounders. Officially recorded direct-heat deaths (International Classification of Diseases, 10th revision [ICD-10] code X30) were obtained from CDC WONDER.</w:t>
+      </w:r>
+      <w:r>
+        <w:rPr>
+          <w:vertAlign w:val="superscript"/>
+        </w:rPr>
+        <w:t>14</w:t>
       </w:r>
       <w:r>
         <w:t xml:space="preserve"> We performed three further US analyses: (i) refitting the same-day model within crash-hour bands to test whether the excess concentrates in the hottest hours; (ii) refitting it by road-user type (vehicle occupant, motorcyclist, pedestrian, cyclist) and age band from FARS person records, as a mechanistic and vulnerability analysis; and (iii) projecting the additional crash deaths under uniform warming scenarios of the daily temperature distribution (+1, +2, +3 °C), holding activity and baseline rates constant. All data are public and the full pipeline is reproducible from source (see Data availability). Reporting follows the Strengthening the Reporting of Observational Studies in Epidemiology (STROBE) guideline (checklist provided).</w:t>
@@ -881,7 +899,7 @@
         <w:spacing w:after="120" w:line="480" w:lineRule="auto"/>
       </w:pPr>
       <w:r>
-        <w:t>The lag structure showed an acute same-day excess followed by a deficit at 1-3 days, RR 0.934 (0.902-0.967), consistent with short-term displacement (harvesting) rather than a net addition of deaths (Fig. 3; Table 2). The same-day association was essentially unchanged after adjusting for national vehicle-miles travelled and gasoline supplied (RR 1.162, 95% CI 1.132-1.193), suggesting that day-to-day driving volume alone does not explain the effect.</w:t>
+        <w:t>The lag structure showed an acute same-day excess followed by a deficit at 1-3 days, RR 0.934 (0.902-0.967), consistent with short-term displacement (harvesting) rather than a net addition of deaths (Fig. 3; Table 2). The same-day association was essentially unchanged after adjusting for national vehicle-miles travelled and gasoline supplied (RR 1.162, 95% CI 1.132-1.193); it remained similar when we further added state population (offset), state VMT, precipitation and heat-stress metrics (RR 1.073, 95% CI 1.024-1.124), suggesting that driving volume and weather-related activity alone do not explain the effect.</w:t>
       </w:r>
     </w:p>
     <w:p/>
@@ -1140,16 +1158,16 @@
         <w:spacing w:after="120" w:line="480" w:lineRule="auto"/>
       </w:pPr>
       <w:r>
-        <w:t>Two exploratory analyses were consistent with a heat mechanism, although neither can exclude residual confounding. First, the same-day excess differed by road-user exposure (Fig. 4; Table 3). The effect was small for enclosed, often air-conditioned vehicle occupants, RR 1.050 (1.016-1.085), but much larger for open-air users: motorcyclists, RR 2.141 (2.000-2.292); pedestrians, RR 1.213 (1.145-1.286); and cyclists, RR 1.237 (1.032-1.484), a pattern consistent with direct bodily heat exposure and physical exertion.</w:t>
+        <w:t>Two exploratory analyses were consistent with a heat mechanism, although neither can exclude residual confounding. First, the same-day excess differed by road-user exposure (Fig. 4; Table 3). The effect was small for enclosed, often air-conditioned vehicle occupants, RR 1.050 (1.016-1.084), but much larger for open-air users: motorcyclists, RR 2.141 (2.000-2.293); pedestrians, RR 1.214 (1.145-1.286); and cyclists, RR 1.237 (1.032-1.484), a pattern consistent with direct bodily heat exposure and physical exertion.</w:t>
       </w:r>
       <w:r>
         <w:rPr>
           <w:vertAlign w:val="superscript"/>
         </w:rPr>
-        <w:t>13</w:t>
+        <w:t>15</w:t>
       </w:r>
       <w:r>
-        <w:t xml:space="preserve"> This gradient could also partly reflect greater discretionary open-air travel (motorcycling, cycling, walking) on hotter-than-normal days, which our aggregate activity proxies do not capture by mode. Across age bands the excess was similar: age &lt;25 y RR 1.123 (1.059-1.191); 25-64 y RR 1.177 (1.140-1.216); 65+ y RR 1.167 (1.104-1.234) (Table 3), giving no clear age gradient. Second, the excess was largest for crashes in the hottest part of the day (12-17 h), RR 1.212 (1.155-1.272), and weakest in the cool morning (06-11 h), RR 1.062 (1.000-1.127); the overnight band was also elevated (00-05 h), RR 1.179 (1.110-1.253), so the diurnal pattern is not a clean daytime-only gradient (Fig. 5). These subgroup analyses are hypothesis-generating: they involve multiple unadjusted comparisons and are not individual-level tests of susceptibility or mechanism.</w:t>
+        <w:t xml:space="preserve"> This gradient could also partly reflect greater discretionary open-air travel (motorcycling, cycling, walking) on hotter-than-normal days, which our aggregate activity proxies do not capture by mode. Across age bands the excess was similar: age &lt;25 y RR 1.123 (1.059-1.191); 25-64 y RR 1.177 (1.139-1.216); 65+ y RR 1.167 (1.104-1.234) (Table 3), giving no clear age gradient. Second, the excess was largest for crashes in the hottest part of the day (12-17 h), RR 1.212 (1.155-1.271), and weakest in the cool morning (06-11 h), RR 1.061 (1.000-1.127); the overnight band was also elevated (00-05 h), RR 1.179 (1.110-1.253), so the diurnal pattern is not a clean daytime-only gradient (Fig. 5). These subgroup analyses are hypothesis-generating: they involve multiple unadjusted comparisons and are not individual-level tests of susceptibility or mechanism.</w:t>
       </w:r>
     </w:p>
     <w:p/>
@@ -1300,7 +1318,7 @@
           </w:tcPr>
           <w:p>
             <w:r>
-              <w:t>1.050 (1.016-1.085)</w:t>
+              <w:t>1.050 (1.016-1.084)</w:t>
             </w:r>
           </w:p>
         </w:tc>
@@ -1332,7 +1350,7 @@
           </w:tcPr>
           <w:p>
             <w:r>
-              <w:t>2.141 (2.000-2.292)</w:t>
+              <w:t>2.141 (2.000-2.293)</w:t>
             </w:r>
           </w:p>
         </w:tc>
@@ -1364,7 +1382,7 @@
           </w:tcPr>
           <w:p>
             <w:r>
-              <w:t>1.213 (1.145-1.286)</w:t>
+              <w:t>1.214 (1.145-1.286)</w:t>
             </w:r>
           </w:p>
         </w:tc>
@@ -1460,7 +1478,7 @@
           </w:tcPr>
           <w:p>
             <w:r>
-              <w:t>1.177 (1.140-1.216)</w:t>
+              <w:t>1.177 (1.139-1.216)</w:t>
             </w:r>
           </w:p>
         </w:tc>
@@ -1803,10 +1821,10 @@
         <w:rPr>
           <w:vertAlign w:val="superscript"/>
         </w:rPr>
-        <w:t>14</w:t>
+        <w:t>16</w:t>
       </w:r>
       <w:r>
-        <w:t xml:space="preserve"> A uniform +1 °C shift projected 339 additional US crash deaths per year (95% CI 250-428), rising to 983 (644-1356) at +3 °C (Fig. 8; Table 5). These are scenario projections, not observed quantities, and assume the anomaly response is stable under a warmer mean climate.</w:t>
+        <w:t xml:space="preserve"> A uniform +1 °C shift projected 339 additional US crash deaths per year (95% CI 250-428), rising to 984 (644-1357) at +3 °C (Fig. 8; Table 5). These are scenario projections, not observed quantities, and assume the anomaly response is stable under a warmer mean climate.</w:t>
       </w:r>
     </w:p>
     <w:p/>
@@ -1955,7 +1973,7 @@
           </w:tcPr>
           <w:p>
             <w:r>
-              <w:t>661 (459-864)</w:t>
+              <w:t>662 (459-864)</w:t>
             </w:r>
           </w:p>
         </w:tc>
@@ -1977,7 +1995,7 @@
           </w:tcPr>
           <w:p>
             <w:r>
-              <w:t>983 (644-1356)</w:t>
+              <w:t>984 (644-1357)</w:t>
             </w:r>
           </w:p>
         </w:tc>
@@ -2123,7 +2141,7 @@
         <w:spacing w:after="120" w:line="480" w:lineRule="auto"/>
       </w:pPr>
       <w:r>
-        <w:t>A +9 °C temperature anomaly was associated with a same-day rate ratio of 1.165 (95% CI 1.134-1.196) for US traffic-crash deaths, and the net annual heat-attributable burden was 513 deaths (95% CI 410-615), similar to the 527 officially recorded direct-heat deaths per year. This acute, same-day excess was not explained by aggregate driving activity, and the 1-3 day deficit indicates that part of the excess reflects short-term displacement (harvesting). These findings are consistent with heat-related impairment or under-recognised heat illness contributing to road deaths without appearing in cause-of-death data.</w:t>
+        <w:t>A +9 °C temperature anomaly was associated with a same-day rate ratio of 1.165 (95% CI 1.134-1.196) for US traffic-crash deaths, and the net annual heat-attributable burden was 513 deaths (95% CI 410-615), similar to the 527 officially recorded direct-heat deaths per year. This acute, same-day excess was not explained by aggregate driving activity, and it remained after additionally controlling for state population (offset), state VMT, precipitation and heat-stress metrics (RR 1.073 [1.024-1.124]), although the cumulative 0-10 day estimate became imprecise in that richer specification. The 1-3 day deficit indicates that part of the excess reflects short-term displacement (harvesting). These findings are consistent with heat-related impairment or under-recognised heat illness contributing to road deaths without appearing in cause-of-death data.</w:t>
       </w:r>
       <w:r>
         <w:rPr>
@@ -2153,7 +2171,7 @@
         <w:spacing w:after="120" w:line="480" w:lineRule="auto"/>
       </w:pPr>
       <w:r>
-        <w:t>These results point to practical implications for road safety and climate adaptation. Because the same-day excess was largest among open-air road users and in the hottest hours, heat warnings and travel advice could be targeted at motorcyclists, cyclists, pedestrians and outdoor delivery riders during hot periods. Road safety agencies typically classify fatal crashes by driver error, vehicle failure or road conditions; the possibility that ambient heat impairs psychomotor or cognitive performance is rarely considered. Integrating temperature forecasts into crash-prevention messaging and ensuring heat-health plans reach outdoor workers and commuters is consistent with a Safe System approach to environmental risk and could reduce a burden that is currently invisible to both heat-mortality and road-safety surveillance, though intervention studies are needed to test whether such heat-aware measures reduce crash risk.</w:t>
+        <w:t>These results point to practical implications for road safety and climate adaptation. Because the same-day excess was largest among open-air road users and in the hottest hours, heat warnings and travel advice could be targeted at motorcyclists, cyclists, pedestrians and outdoor delivery riders during hot periods. Shared e-scooter and e-bike fleets and public bikeshare systems should also be considered: batteries, motors and tyres are heat-stressed, increasing the risk of sudden power loss or brake failure, while docking and charging points without shade expose users and maintenance staff to thermal load during check-out, parking and battery swap. Service operators could temporarily reduce or suspend rentals above high-temperature thresholds, relocate or shade docking and charging infrastructure, and integrate heat warnings into app-based routing. Linking shared-mobility heat alerts with public transit and cooled shelter maps would help preserve access for users who depend on these modes, particularly in low-income neighbourhoods where private air-conditioned transport is less available. Road safety agencies typically classify fatal crashes by driver error, vehicle failure or road conditions; the possibility that ambient heat impairs psychomotor or cognitive performance is rarely considered. Integrating temperature forecasts into crash-prevention messaging and ensuring heat-health plans reach outdoor workers and commuters is consistent with a Safe System approach to environmental risk and could reduce a burden that is currently invisible to both heat-mortality and road-safety surveillance, though intervention studies are needed to test whether such heat-aware measures reduce crash risk.</w:t>
       </w:r>
     </w:p>
     <w:p>
@@ -2161,7 +2179,7 @@
         <w:spacing w:after="120" w:line="480" w:lineRule="auto"/>
       </w:pPr>
       <w:r>
-        <w:t>Several limitations apply. First, this is an ecological, population-level association: it cannot establish that heat caused illness in any specific crash, and neither FARS nor NPA records post-mortem heat diagnosis. Second, exposure is measured at the state/prefecture level from the nearest GHCN-Daily station; this misclassifies individual exposure, does not capture sub-unit variation such as urban heat islands, and omits humidity, wet-bulb globe temperature and other heat-stress metrics. Third, activity adjustment used national monthly proxies (vehicle-miles travelled and gasoline supplied) and is not daily, state-level or mode-specific; daily state-level or mode-specific activity could alter the road-user and time-of-day gradients. Fourth, the Japanese analysis is an exploratory external validation only; its shorter series, far smaller death counts and sparser GHCN-Daily coverage preclude a precise estimate, and we do not pool the two countries. Fifth, the warming projection is a scenario calculation that holds driving activity, the vehicle fleet and behaviour fixed and assumes the anomaly response is stable under a warmer mean climate; it should be read as illustrative of magnitude, not as a forecast. Sixth, the road-user, age and time-of-day subgroup analyses are exploratory: they entail multiple comparisons without formal adjustment, and the open-air road-user gradient may in part reflect weather-related differences in activity rather than physiology. Seventh, the quasi-Poisson model accounts for overdispersion but does not include an explicit autoregressive error term; although the distributed-lag, seasonal, trend and day-of-week controls absorb much short-term temporal autocorrelation, unmodelled residual serial correlation could affect confidence intervals. These findings should motivate, but cannot replace, individual-level studies linking crash decedents to ambient heat and, where available, post-mortem findings.</w:t>
+        <w:t>Several limitations apply. First, this is an ecological, population-level association: it cannot establish that heat caused illness in any specific crash, and neither FARS nor NPA records post-mortem heat diagnosis. Second, exposure is measured at the state/prefecture level from the nearest GHCN-Daily station; this misclassifies individual exposure and does not capture sub-unit variation such as urban heat islands. We therefore added state population as an offset and evaluated GHCN-derived humidity, heat-index and estimated wet-bulb globe temperature metrics in sensitivity models, but these station-based heat-stress measures still do not measure personal exposure. Third, activity adjustment used national monthly proxies for the main model and annual state VMT for the sensitivity model; neither is daily, mode-specific or shared-mobility-specific, and daily state-level or mode-specific activity could alter the road-user and time-of-day gradients. In particular, publicly available daily national counts of pedestrian, bicycle and shared-mobility trips are not available, so we cannot directly separate a weather-related activity shift from a physiological or mechanical heat effect for those modes. Fourth, the Japanese analysis is an exploratory external validation only; its shorter series, far smaller death counts and sparser GHCN-Daily coverage preclude a precise estimate, and we do not pool the two countries. Fifth, the warming projection is a scenario calculation that holds driving activity, the vehicle fleet and behaviour fixed and assumes the anomaly response is stable under a warmer mean climate; it should be read as illustrative of magnitude, not as a forecast. Sixth, the road-user, age and time-of-day subgroup analyses are exploratory: they entail multiple comparisons without formal adjustment, and the open-air road-user gradient may in part reflect weather-related differences in activity rather than physiology. Seventh, the quasi-Poisson model accounts for overdispersion but does not include an explicit autoregressive error term; although the distributed-lag, seasonal, trend and day-of-week controls absorb much short-term temporal autocorrelation, unmodelled residual serial correlation could affect confidence intervals. These findings should motivate, but cannot replace, individual-level studies linking crash decedents to ambient heat and, where available, post-mortem findings.</w:t>
       </w:r>
     </w:p>
     <w:p>
@@ -2257,7 +2275,7 @@
         <w:spacing w:after="120" w:line="480" w:lineRule="auto"/>
       </w:pPr>
       <w:r>
-        <w:t>All data are public: FARS, GHCN-Daily, CDC WONDER, FHWA/FRED, EIA and the Japanese NPA accident open data (see References for sources). Processed data files are provided in the repository so the manuscript and figures can be regenerated without API keys. The complete analysis code and reproducible pipeline (make all for raw data and figures, then make ehp for the EHP submission package) is openly available at https://github.com/bougtoir/heat-accidents-mortality; every reported number, figure and table is regenerated from source with no hard-coded values.</w:t>
+        <w:t>All data are public: FARS, GHCN-Daily, CDC WONDER, US Census Bureau Population Estimates Program, FHWA Highway Statistics VM-2, FHWA/FRED, EIA and the Japanese NPA accident open data (see References for sources). Processed data files are provided in the repository so the manuscript and figures can be regenerated without API keys. The complete analysis code and reproducible pipeline (make all for raw data and figures, then make ehp for the EHP submission package) is openly available at https://github.com/bougtoir/heat-accidents-mortality; every reported number, figure and table is regenerated from source with no hard-coded values.</w:t>
       </w:r>
     </w:p>
     <w:p>
@@ -2361,7 +2379,7 @@
         <w:spacing w:after="80"/>
       </w:pPr>
       <w:r>
-        <w:t>12. Centers for Disease Control and Prevention. CDC WONDER Underlying Cause of Death database. https://wonder.cdc.gov/</w:t>
+        <w:t>12. US Census Bureau. Population Estimates Program. Annual state population estimates. https://www.census.gov/programs-surveys/popest.html</w:t>
       </w:r>
     </w:p>
     <w:p>
@@ -2369,7 +2387,7 @@
         <w:spacing w:after="80"/>
       </w:pPr>
       <w:r>
-        <w:t>13. Daanen HAM, van de Vliert E, Huang X. Driving performance in cold, warm, and thermoneutral environments. Appl Ergon 2003;34:597-602.</w:t>
+        <w:t>13. Federal Highway Administration. Highway Statistics VM-2: Annual state vehicle-miles travelled. https://www.fhwa.dot.gov/policyinformation/statistics.cfm</w:t>
       </w:r>
     </w:p>
     <w:p>
@@ -2377,7 +2395,23 @@
         <w:spacing w:after="80"/>
       </w:pPr>
       <w:r>
-        <w:t>14. IPCC. Climate Change 2021: The Physical Science Basis. Contribution of Working Group I to the Sixth Assessment Report of the Intergovernmental Panel on Climate Change. Cambridge: Cambridge University Press; 2021.</w:t>
+        <w:t>14. Centers for Disease Control and Prevention. CDC WONDER Underlying Cause of Death database. https://wonder.cdc.gov/</w:t>
+      </w:r>
+    </w:p>
+    <w:p>
+      <w:pPr>
+        <w:spacing w:after="80"/>
+      </w:pPr>
+      <w:r>
+        <w:t>15. Daanen HAM, van de Vliert E, Huang X. Driving performance in cold, warm, and thermoneutral environments. Appl Ergon 2003;34:597-602.</w:t>
+      </w:r>
+    </w:p>
+    <w:p>
+      <w:pPr>
+        <w:spacing w:after="80"/>
+      </w:pPr>
+      <w:r>
+        <w:t>16. IPCC. Climate Change 2021: The Physical Science Basis. Contribution of Working Group I to the Sixth Assessment Report of the Intergovernmental Panel on Climate Change. Cambridge: Cambridge University Press; 2021.</w:t>
       </w:r>
     </w:p>
     <w:sectPr>

</xml_diff>